<commit_message>
Add current-state and recovery strategy columns to the Word register
Replace the dependency-only table with Activity, Potential Risk, single points of failure, existing safeguards, recovery strategy, alternate site/access, and cross-trained backup staff for all 20 activities.

Co-authored-by: eyushans <eyushans@gmail.com>
</commit_message>
<xml_diff>
--- a/Technical_Department_BIA_Register.docx
+++ b/Technical_Department_BIA_Register.docx
@@ -27,7 +27,7 @@
           <w:color w:val="1A1A1A"/>
           <w:sz w:val="20"/>
         </w:rPr>
-        <w:t>This register maps each functional activity area performed by the Technical Department to its potential risk and to its dependencies: what it relies on, who relies on it, and the systems, records, people, and vendors that keep it running. Only Activity and Potential Risk are kept from the original register. Personnel are shown as role titles (Primary / Backup), not named staff, until the team confirms owners. Product names already used elsewhere in the organisation BIA (Oracle ERP, ticketing portal, VPN) are reused where they apply; other tools are described by function so we do not invent a stack.</w:t>
+        <w:t>This register maps each functional activity area performed by the Technical Department to its potential risk, current-state gaps, and recovery strategy. Only Activity and Potential Risk are kept from the original register. Alternate Site/Access Required? and Cross-Trained Backup Staff Identified? use Yes / Partial / No with a short note. Cross-training is Partial until a named, trained deputy is confirmed.</w:t>
       </w:r>
     </w:p>
     <w:p>
@@ -41,7 +41,7 @@
           <w:color w:val="1B365D"/>
           <w:sz w:val="18"/>
         </w:rPr>
-        <w:t xml:space="preserve">Upstream: </w:t>
+        <w:t xml:space="preserve">Single Points of Failure: </w:t>
       </w:r>
       <w:r>
         <w:rPr>
@@ -50,7 +50,7 @@
           <w:color w:val="334155"/>
           <w:sz w:val="18"/>
         </w:rPr>
-        <w:t>What this activity relies on — teams, inputs, infrastructure, or contracts that must be available before the work can be done.</w:t>
+        <w:t>The one person, system, vendor, or path whose loss stops this activity.</w:t>
       </w:r>
       <w:r>
         <w:rPr>
@@ -68,7 +68,7 @@
           <w:color w:val="1B365D"/>
           <w:sz w:val="18"/>
         </w:rPr>
-        <w:t xml:space="preserve">Downstream: </w:t>
+        <w:t xml:space="preserve">Existing Safeguards / Controls: </w:t>
       </w:r>
       <w:r>
         <w:rPr>
@@ -77,7 +77,7 @@
           <w:color w:val="334155"/>
           <w:sz w:val="18"/>
         </w:rPr>
-        <w:t>Who relies on this activity — internal teams or client-facing functions that stall or fail if it stops.</w:t>
+        <w:t>What is already in place to reduce the risk or absorb a short disruption.</w:t>
       </w:r>
       <w:r>
         <w:rPr>
@@ -95,7 +95,7 @@
           <w:color w:val="1B365D"/>
           <w:sz w:val="18"/>
         </w:rPr>
-        <w:t xml:space="preserve">Key Systems: </w:t>
+        <w:t xml:space="preserve">Recommended Recovery Strategy: </w:t>
       </w:r>
       <w:r>
         <w:rPr>
@@ -104,7 +104,7 @@
           <w:color w:val="334155"/>
           <w:sz w:val="18"/>
         </w:rPr>
-        <w:t>Applications and platforms used to perform the work.</w:t>
+        <w:t>How to restore minimum service if the activity is disrupted.</w:t>
       </w:r>
       <w:r>
         <w:rPr>
@@ -122,7 +122,7 @@
           <w:color w:val="1B365D"/>
           <w:sz w:val="18"/>
         </w:rPr>
-        <w:t xml:space="preserve">Key Data: </w:t>
+        <w:t xml:space="preserve">Alternate Site/Access: </w:t>
       </w:r>
       <w:r>
         <w:rPr>
@@ -131,7 +131,7 @@
           <w:color w:val="334155"/>
           <w:sz w:val="18"/>
         </w:rPr>
-        <w:t>Records this activity creates, changes, or must have.</w:t>
+        <w:t>Whether staff can keep working from another site or via remote/VPN access.</w:t>
       </w:r>
       <w:r>
         <w:rPr>
@@ -149,7 +149,7 @@
           <w:color w:val="1B365D"/>
           <w:sz w:val="18"/>
         </w:rPr>
-        <w:t xml:space="preserve">Key Personnel: </w:t>
+        <w:t xml:space="preserve">Cross-Trained Backup: </w:t>
       </w:r>
       <w:r>
         <w:rPr>
@@ -158,34 +158,7 @@
           <w:color w:val="334155"/>
           <w:sz w:val="18"/>
         </w:rPr>
-        <w:t>Named owner and deputy. Format: Name (Primary) / Name (Backup). Roles are placeholders.</w:t>
-      </w:r>
-      <w:r>
-        <w:rPr>
-          <w:rFonts w:ascii="Calibri" w:hAnsi="Calibri" w:eastAsia="Calibri"/>
-          <w:b w:val="0"/>
-          <w:color w:val="94A3B8"/>
-          <w:sz w:val="18"/>
-        </w:rPr>
-        <w:t xml:space="preserve">  |  </w:t>
-      </w:r>
-      <w:r>
-        <w:rPr>
-          <w:rFonts w:ascii="Calibri" w:hAnsi="Calibri" w:eastAsia="Calibri"/>
-          <w:b/>
-          <w:color w:val="1B365D"/>
-          <w:sz w:val="18"/>
-        </w:rPr>
-        <w:t xml:space="preserve">Key Vendors: </w:t>
-      </w:r>
-      <w:r>
-        <w:rPr>
-          <w:rFonts w:ascii="Calibri" w:hAnsi="Calibri" w:eastAsia="Calibri"/>
-          <w:b w:val="0"/>
-          <w:color w:val="334155"/>
-          <w:sz w:val="18"/>
-        </w:rPr>
-        <w:t>External organisations this activity depends on.</w:t>
+        <w:t>Whether a trained deputy exists. Partial = backup role designated, named trained person not confirmed.</w:t>
       </w:r>
     </w:p>
     <w:tbl>
@@ -193,17 +166,16 @@
         <w:jc w:val="center"/>
         <w:tblLook w:firstColumn="1" w:firstRow="1" w:lastColumn="0" w:lastRow="0" w:noHBand="0" w:noVBand="1" w:val="04A0"/>
         <w:tblLayout w:type="fixed"/>
-        <w:tblW w:w="20185" w:type="dxa"/>
+        <w:tblW w:w="19278" w:type="dxa"/>
       </w:tblPr>
       <w:tblGrid>
         <w:gridCol w:w="1927"/>
         <w:gridCol w:w="2608"/>
-        <w:gridCol w:w="2948"/>
-        <w:gridCol w:w="2835"/>
-        <w:gridCol w:w="2494"/>
+        <w:gridCol w:w="3175"/>
+        <w:gridCol w:w="3175"/>
+        <w:gridCol w:w="3515"/>
+        <w:gridCol w:w="2268"/>
         <w:gridCol w:w="2608"/>
-        <w:gridCol w:w="2381"/>
-        <w:gridCol w:w="2381"/>
       </w:tblGrid>
       <w:tr>
         <w:trPr>
@@ -248,8 +220,44 @@
         </w:tc>
         <w:tc>
           <w:tcPr>
-            <w:tcW w:type="dxa" w:w="2381"/>
-            <w:gridSpan w:val="6"/>
+            <w:tcW w:type="dxa" w:w="3175"/>
+            <w:gridSpan w:val="2"/>
+            <w:vAlign w:val="center"/>
+            <w:tcMar>
+              <w:top w:w="40" w:type="dxa"/>
+              <w:left w:w="60" w:type="dxa"/>
+              <w:bottom w:w="40" w:type="dxa"/>
+              <w:right w:w="60" w:type="dxa"/>
+            </w:tcMar>
+            <w:tcBorders>
+              <w:top w:val="single" w:sz="4" w:space="0" w:color="8AA0B4"/>
+              <w:left w:val="single" w:sz="4" w:space="0" w:color="8AA0B4"/>
+              <w:bottom w:val="single" w:sz="4" w:space="0" w:color="8AA0B4"/>
+              <w:right w:val="single" w:sz="4" w:space="0" w:color="8AA0B4"/>
+            </w:tcBorders>
+            <w:shd w:fill="1F7A8C" w:val="clear"/>
+          </w:tcPr>
+          <w:p>
+            <w:pPr>
+              <w:spacing w:before="0" w:after="0" w:line="252" w:lineRule="auto"/>
+              <w:jc w:val="center"/>
+            </w:pPr>
+            <w:r/>
+            <w:r>
+              <w:rPr>
+                <w:rFonts w:ascii="Calibri" w:hAnsi="Calibri" w:eastAsia="Calibri"/>
+                <w:b/>
+                <w:color w:val="FFFFFF"/>
+                <w:sz w:val="18"/>
+              </w:rPr>
+              <w:t>CURRENT STATE &amp; GAP</w:t>
+            </w:r>
+          </w:p>
+        </w:tc>
+        <w:tc>
+          <w:tcPr>
+            <w:tcW w:type="dxa" w:w="2608"/>
+            <w:gridSpan w:val="3"/>
             <w:vAlign w:val="center"/>
             <w:tcMar>
               <w:top w:w="40" w:type="dxa"/>
@@ -278,7 +286,7 @@
                 <w:color w:val="FFFFFF"/>
                 <w:sz w:val="18"/>
               </w:rPr>
-              <w:t>DEPENDENCIES</w:t>
+              <w:t>STRATEGY &amp; RECOVERY</w:t>
             </w:r>
           </w:p>
         </w:tc>
@@ -360,7 +368,77 @@
         </w:tc>
         <w:tc>
           <w:tcPr>
-            <w:tcW w:type="dxa" w:w="2948"/>
+            <w:tcW w:type="dxa" w:w="3175"/>
+            <w:vAlign w:val="center"/>
+            <w:tcMar>
+              <w:top w:w="40" w:type="dxa"/>
+              <w:left w:w="60" w:type="dxa"/>
+              <w:bottom w:w="40" w:type="dxa"/>
+              <w:right w:w="60" w:type="dxa"/>
+            </w:tcMar>
+            <w:tcBorders>
+              <w:top w:val="single" w:sz="4" w:space="0" w:color="8AA0B4"/>
+              <w:left w:val="single" w:sz="4" w:space="0" w:color="8AA0B4"/>
+              <w:bottom w:val="single" w:sz="4" w:space="0" w:color="8AA0B4"/>
+              <w:right w:val="single" w:sz="4" w:space="0" w:color="8AA0B4"/>
+            </w:tcBorders>
+            <w:shd w:fill="1F7A8C" w:val="clear"/>
+          </w:tcPr>
+          <w:p>
+            <w:pPr>
+              <w:spacing w:before="0" w:after="0" w:line="252" w:lineRule="auto"/>
+              <w:jc w:val="center"/>
+            </w:pPr>
+            <w:r/>
+            <w:r>
+              <w:rPr>
+                <w:rFonts w:ascii="Calibri" w:hAnsi="Calibri" w:eastAsia="Calibri"/>
+                <w:b/>
+                <w:color w:val="FFFFFF"/>
+                <w:sz w:val="16"/>
+              </w:rPr>
+              <w:t>Single Points of Failure</w:t>
+            </w:r>
+          </w:p>
+        </w:tc>
+        <w:tc>
+          <w:tcPr>
+            <w:tcW w:type="dxa" w:w="3175"/>
+            <w:vAlign w:val="center"/>
+            <w:tcMar>
+              <w:top w:w="40" w:type="dxa"/>
+              <w:left w:w="60" w:type="dxa"/>
+              <w:bottom w:w="40" w:type="dxa"/>
+              <w:right w:w="60" w:type="dxa"/>
+            </w:tcMar>
+            <w:tcBorders>
+              <w:top w:val="single" w:sz="4" w:space="0" w:color="8AA0B4"/>
+              <w:left w:val="single" w:sz="4" w:space="0" w:color="8AA0B4"/>
+              <w:bottom w:val="single" w:sz="4" w:space="0" w:color="8AA0B4"/>
+              <w:right w:val="single" w:sz="4" w:space="0" w:color="8AA0B4"/>
+            </w:tcBorders>
+            <w:shd w:fill="1F7A8C" w:val="clear"/>
+          </w:tcPr>
+          <w:p>
+            <w:pPr>
+              <w:spacing w:before="0" w:after="0" w:line="252" w:lineRule="auto"/>
+              <w:jc w:val="center"/>
+            </w:pPr>
+            <w:r/>
+            <w:r>
+              <w:rPr>
+                <w:rFonts w:ascii="Calibri" w:hAnsi="Calibri" w:eastAsia="Calibri"/>
+                <w:b/>
+                <w:color w:val="FFFFFF"/>
+                <w:sz w:val="16"/>
+              </w:rPr>
+              <w:t>Existing Safeguards / Controls</w:t>
+            </w:r>
+          </w:p>
+        </w:tc>
+        <w:tc>
+          <w:tcPr>
+            <w:tcW w:type="dxa" w:w="3515"/>
             <w:vAlign w:val="center"/>
             <w:tcMar>
               <w:top w:w="40" w:type="dxa"/>
@@ -389,13 +467,13 @@
                 <w:color w:val="FFFFFF"/>
                 <w:sz w:val="16"/>
               </w:rPr>
-              <w:t>Upstream Dependencies (Relies On)</w:t>
+              <w:t>Recommended Recovery Strategy</w:t>
             </w:r>
           </w:p>
         </w:tc>
         <w:tc>
           <w:tcPr>
-            <w:tcW w:type="dxa" w:w="2835"/>
+            <w:tcW w:type="dxa" w:w="2268"/>
             <w:vAlign w:val="center"/>
             <w:tcMar>
               <w:top w:w="40" w:type="dxa"/>
@@ -424,42 +502,7 @@
                 <w:color w:val="FFFFFF"/>
                 <w:sz w:val="16"/>
               </w:rPr>
-              <w:t>Downstream Dependencies (Relied On By)</w:t>
-            </w:r>
-          </w:p>
-        </w:tc>
-        <w:tc>
-          <w:tcPr>
-            <w:tcW w:type="dxa" w:w="2494"/>
-            <w:vAlign w:val="center"/>
-            <w:tcMar>
-              <w:top w:w="40" w:type="dxa"/>
-              <w:left w:w="60" w:type="dxa"/>
-              <w:bottom w:w="40" w:type="dxa"/>
-              <w:right w:w="60" w:type="dxa"/>
-            </w:tcMar>
-            <w:tcBorders>
-              <w:top w:val="single" w:sz="4" w:space="0" w:color="8AA0B4"/>
-              <w:left w:val="single" w:sz="4" w:space="0" w:color="8AA0B4"/>
-              <w:bottom w:val="single" w:sz="4" w:space="0" w:color="8AA0B4"/>
-              <w:right w:val="single" w:sz="4" w:space="0" w:color="8AA0B4"/>
-            </w:tcBorders>
-            <w:shd w:fill="1B365D" w:val="clear"/>
-          </w:tcPr>
-          <w:p>
-            <w:pPr>
-              <w:spacing w:before="0" w:after="0" w:line="252" w:lineRule="auto"/>
-              <w:jc w:val="center"/>
-            </w:pPr>
-            <w:r/>
-            <w:r>
-              <w:rPr>
-                <w:rFonts w:ascii="Calibri" w:hAnsi="Calibri" w:eastAsia="Calibri"/>
-                <w:b/>
-                <w:color w:val="FFFFFF"/>
-                <w:sz w:val="16"/>
-              </w:rPr>
-              <w:t>Key Systems / Applications</w:t>
+              <w:t>Alternate Site/Access Required?</w:t>
             </w:r>
           </w:p>
         </w:tc>
@@ -494,77 +537,7 @@
                 <w:color w:val="FFFFFF"/>
                 <w:sz w:val="16"/>
               </w:rPr>
-              <w:t>Key Data / Records</w:t>
-            </w:r>
-          </w:p>
-        </w:tc>
-        <w:tc>
-          <w:tcPr>
-            <w:tcW w:type="dxa" w:w="2381"/>
-            <w:vAlign w:val="center"/>
-            <w:tcMar>
-              <w:top w:w="40" w:type="dxa"/>
-              <w:left w:w="60" w:type="dxa"/>
-              <w:bottom w:w="40" w:type="dxa"/>
-              <w:right w:w="60" w:type="dxa"/>
-            </w:tcMar>
-            <w:tcBorders>
-              <w:top w:val="single" w:sz="4" w:space="0" w:color="8AA0B4"/>
-              <w:left w:val="single" w:sz="4" w:space="0" w:color="8AA0B4"/>
-              <w:bottom w:val="single" w:sz="4" w:space="0" w:color="8AA0B4"/>
-              <w:right w:val="single" w:sz="4" w:space="0" w:color="8AA0B4"/>
-            </w:tcBorders>
-            <w:shd w:fill="1B365D" w:val="clear"/>
-          </w:tcPr>
-          <w:p>
-            <w:pPr>
-              <w:spacing w:before="0" w:after="0" w:line="252" w:lineRule="auto"/>
-              <w:jc w:val="center"/>
-            </w:pPr>
-            <w:r/>
-            <w:r>
-              <w:rPr>
-                <w:rFonts w:ascii="Calibri" w:hAnsi="Calibri" w:eastAsia="Calibri"/>
-                <w:b/>
-                <w:color w:val="FFFFFF"/>
-                <w:sz w:val="16"/>
-              </w:rPr>
-              <w:t>Key Personnel (Primary + Backup)</w:t>
-            </w:r>
-          </w:p>
-        </w:tc>
-        <w:tc>
-          <w:tcPr>
-            <w:tcW w:type="dxa" w:w="2381"/>
-            <w:vAlign w:val="center"/>
-            <w:tcMar>
-              <w:top w:w="40" w:type="dxa"/>
-              <w:left w:w="60" w:type="dxa"/>
-              <w:bottom w:w="40" w:type="dxa"/>
-              <w:right w:w="60" w:type="dxa"/>
-            </w:tcMar>
-            <w:tcBorders>
-              <w:top w:val="single" w:sz="4" w:space="0" w:color="8AA0B4"/>
-              <w:left w:val="single" w:sz="4" w:space="0" w:color="8AA0B4"/>
-              <w:bottom w:val="single" w:sz="4" w:space="0" w:color="8AA0B4"/>
-              <w:right w:val="single" w:sz="4" w:space="0" w:color="8AA0B4"/>
-            </w:tcBorders>
-            <w:shd w:fill="1B365D" w:val="clear"/>
-          </w:tcPr>
-          <w:p>
-            <w:pPr>
-              <w:spacing w:before="0" w:after="0" w:line="252" w:lineRule="auto"/>
-              <w:jc w:val="center"/>
-            </w:pPr>
-            <w:r/>
-            <w:r>
-              <w:rPr>
-                <w:rFonts w:ascii="Calibri" w:hAnsi="Calibri" w:eastAsia="Calibri"/>
-                <w:b/>
-                <w:color w:val="FFFFFF"/>
-                <w:sz w:val="16"/>
-              </w:rPr>
-              <w:t>Key Vendors / Third Parties</w:t>
+              <w:t>Cross-Trained Backup Staff Identified?</w:t>
             </w:r>
           </w:p>
         </w:tc>
@@ -645,7 +618,7 @@
         </w:tc>
         <w:tc>
           <w:tcPr>
-            <w:tcW w:type="dxa" w:w="2948"/>
+            <w:tcW w:type="dxa" w:w="3175"/>
             <w:vAlign w:val="center"/>
             <w:tcMar>
               <w:top w:w="40" w:type="dxa"/>
@@ -674,13 +647,13 @@
                 <w:color w:val="1A1A1A"/>
                 <w:sz w:val="16"/>
               </w:rPr>
-              <w:t>Business Development client brief and proposal window; Implementation Functional Unit process knowledge; VPN for client discovery</w:t>
+              <w:t>Solutions Architect as the only designer; design pack held in one workspace or one mailbox</w:t>
             </w:r>
           </w:p>
         </w:tc>
         <w:tc>
           <w:tcPr>
-            <w:tcW w:type="dxa" w:w="2835"/>
+            <w:tcW w:type="dxa" w:w="3175"/>
             <w:vAlign w:val="center"/>
             <w:tcMar>
               <w:top w:w="40" w:type="dxa"/>
@@ -709,13 +682,13 @@
                 <w:color w:val="1A1A1A"/>
                 <w:sz w:val="16"/>
               </w:rPr>
-              <w:t>Implementation Technical Unit (build against the design); Business Development (proposal commitment and dates)</w:t>
+              <w:t>Functional Unit design review; shared requirements repository</w:t>
             </w:r>
           </w:p>
         </w:tc>
         <w:tc>
           <w:tcPr>
-            <w:tcW w:type="dxa" w:w="2494"/>
+            <w:tcW w:type="dxa" w:w="3515"/>
             <w:vAlign w:val="center"/>
             <w:tcMar>
               <w:top w:w="40" w:type="dxa"/>
@@ -744,7 +717,42 @@
                 <w:color w:val="1A1A1A"/>
                 <w:sz w:val="16"/>
               </w:rPr>
-              <w:t>Design/requirements repository; proposal workspace; VPN</w:t>
+              <w:t>Functional Lead continues from the shared spec; restore documents from the repository backup</w:t>
+            </w:r>
+          </w:p>
+        </w:tc>
+        <w:tc>
+          <w:tcPr>
+            <w:tcW w:type="dxa" w:w="2268"/>
+            <w:vAlign w:val="center"/>
+            <w:tcMar>
+              <w:top w:w="40" w:type="dxa"/>
+              <w:left w:w="60" w:type="dxa"/>
+              <w:bottom w:w="40" w:type="dxa"/>
+              <w:right w:w="60" w:type="dxa"/>
+            </w:tcMar>
+            <w:tcBorders>
+              <w:top w:val="single" w:sz="4" w:space="0" w:color="8AA0B4"/>
+              <w:left w:val="single" w:sz="4" w:space="0" w:color="8AA0B4"/>
+              <w:bottom w:val="single" w:sz="4" w:space="0" w:color="8AA0B4"/>
+              <w:right w:val="single" w:sz="4" w:space="0" w:color="8AA0B4"/>
+            </w:tcBorders>
+            <w:shd w:fill="82C785" w:val="clear"/>
+          </w:tcPr>
+          <w:p>
+            <w:pPr>
+              <w:spacing w:before="0" w:after="0" w:line="252" w:lineRule="auto"/>
+              <w:jc w:val="center"/>
+            </w:pPr>
+            <w:r/>
+            <w:r>
+              <w:rPr>
+                <w:rFonts w:ascii="Calibri" w:hAnsi="Calibri" w:eastAsia="Calibri"/>
+                <w:b/>
+                <w:color w:val="1A1A1A"/>
+                <w:sz w:val="16"/>
+              </w:rPr>
+              <w:t>Yes — VPN / remote</w:t>
             </w:r>
           </w:p>
         </w:tc>
@@ -764,42 +772,7 @@
               <w:bottom w:val="single" w:sz="4" w:space="0" w:color="8AA0B4"/>
               <w:right w:val="single" w:sz="4" w:space="0" w:color="8AA0B4"/>
             </w:tcBorders>
-            <w:shd w:fill="FFFFFF" w:val="clear"/>
-          </w:tcPr>
-          <w:p>
-            <w:pPr>
-              <w:spacing w:before="0" w:after="0" w:line="252" w:lineRule="auto"/>
-              <w:jc w:val="left"/>
-            </w:pPr>
-            <w:r/>
-            <w:r>
-              <w:rPr>
-                <w:rFonts w:ascii="Calibri" w:hAnsi="Calibri" w:eastAsia="Calibri"/>
-                <w:b w:val="0"/>
-                <w:color w:val="1A1A1A"/>
-                <w:sz w:val="16"/>
-              </w:rPr>
-              <w:t>Requirements specs; solution design documents; acceptance criteria; client process notes</w:t>
-            </w:r>
-          </w:p>
-        </w:tc>
-        <w:tc>
-          <w:tcPr>
-            <w:tcW w:type="dxa" w:w="2381"/>
-            <w:vAlign w:val="center"/>
-            <w:tcMar>
-              <w:top w:w="40" w:type="dxa"/>
-              <w:left w:w="60" w:type="dxa"/>
-              <w:bottom w:w="40" w:type="dxa"/>
-              <w:right w:w="60" w:type="dxa"/>
-            </w:tcMar>
-            <w:tcBorders>
-              <w:top w:val="single" w:sz="4" w:space="0" w:color="8AA0B4"/>
-              <w:left w:val="single" w:sz="4" w:space="0" w:color="8AA0B4"/>
-              <w:bottom w:val="single" w:sz="4" w:space="0" w:color="8AA0B4"/>
-              <w:right w:val="single" w:sz="4" w:space="0" w:color="8AA0B4"/>
-            </w:tcBorders>
-            <w:shd w:fill="FFFFFF" w:val="clear"/>
+            <w:shd w:fill="F4D03F" w:val="clear"/>
           </w:tcPr>
           <w:p>
             <w:pPr>
@@ -814,42 +787,7 @@
                 <w:color w:val="1A1A1A"/>
                 <w:sz w:val="16"/>
               </w:rPr>
-              <w:t>Solutions Architect (Primary) / Functional Lead (Backup)</w:t>
-            </w:r>
-          </w:p>
-        </w:tc>
-        <w:tc>
-          <w:tcPr>
-            <w:tcW w:type="dxa" w:w="2381"/>
-            <w:vAlign w:val="center"/>
-            <w:tcMar>
-              <w:top w:w="40" w:type="dxa"/>
-              <w:left w:w="60" w:type="dxa"/>
-              <w:bottom w:w="40" w:type="dxa"/>
-              <w:right w:w="60" w:type="dxa"/>
-            </w:tcMar>
-            <w:tcBorders>
-              <w:top w:val="single" w:sz="4" w:space="0" w:color="8AA0B4"/>
-              <w:left w:val="single" w:sz="4" w:space="0" w:color="8AA0B4"/>
-              <w:bottom w:val="single" w:sz="4" w:space="0" w:color="8AA0B4"/>
-              <w:right w:val="single" w:sz="4" w:space="0" w:color="8AA0B4"/>
-            </w:tcBorders>
-            <w:shd w:fill="FFFFFF" w:val="clear"/>
-          </w:tcPr>
-          <w:p>
-            <w:pPr>
-              <w:spacing w:before="0" w:after="0" w:line="252" w:lineRule="auto"/>
-              <w:jc w:val="left"/>
-            </w:pPr>
-            <w:r/>
-            <w:r>
-              <w:rPr>
-                <w:rFonts w:ascii="Calibri" w:hAnsi="Calibri" w:eastAsia="Calibri"/>
-                <w:b w:val="0"/>
-                <w:color w:val="1A1A1A"/>
-                <w:sz w:val="16"/>
-              </w:rPr>
-              <w:t>Oracle Corporation (product documentation, where the client estate is Oracle)</w:t>
+              <w:t>Partial — Functional Lead designated as backup; named trained deputy not confirmed</w:t>
             </w:r>
           </w:p>
         </w:tc>
@@ -930,7 +868,7 @@
         </w:tc>
         <w:tc>
           <w:tcPr>
-            <w:tcW w:type="dxa" w:w="2948"/>
+            <w:tcW w:type="dxa" w:w="3175"/>
             <w:vAlign w:val="center"/>
             <w:tcMar>
               <w:top w:w="40" w:type="dxa"/>
@@ -959,13 +897,13 @@
                 <w:color w:val="1A1A1A"/>
                 <w:sz w:val="16"/>
               </w:rPr>
-              <w:t>Approved requirements and design; source control availability; development environment; VPN</w:t>
+              <w:t>Lead Developer knowledge of a module; uncommitted code on one workstation</w:t>
             </w:r>
           </w:p>
         </w:tc>
         <w:tc>
           <w:tcPr>
-            <w:tcW w:type="dxa" w:w="2835"/>
+            <w:tcW w:type="dxa" w:w="3175"/>
             <w:vAlign w:val="center"/>
             <w:tcMar>
               <w:top w:w="40" w:type="dxa"/>
@@ -994,13 +932,13 @@
                 <w:color w:val="1A1A1A"/>
                 <w:sz w:val="16"/>
               </w:rPr>
-              <w:t>Code Review; Testing &amp; QA; Build Management; CI/CD Pipeline</w:t>
+              <w:t>Source control; coding standards; peer review before merge</w:t>
             </w:r>
           </w:p>
         </w:tc>
         <w:tc>
           <w:tcPr>
-            <w:tcW w:type="dxa" w:w="2494"/>
+            <w:tcW w:type="dxa" w:w="3515"/>
             <w:vAlign w:val="center"/>
             <w:tcMar>
               <w:top w:w="40" w:type="dxa"/>
@@ -1029,7 +967,42 @@
                 <w:color w:val="1A1A1A"/>
                 <w:sz w:val="16"/>
               </w:rPr>
-              <w:t>Development workstations; source control platform; development environment; VPN</w:t>
+              <w:t>Senior Developer continues from last commit; rebuild the workstation; do not rely on local uncommitted work</w:t>
+            </w:r>
+          </w:p>
+        </w:tc>
+        <w:tc>
+          <w:tcPr>
+            <w:tcW w:type="dxa" w:w="2268"/>
+            <w:vAlign w:val="center"/>
+            <w:tcMar>
+              <w:top w:w="40" w:type="dxa"/>
+              <w:left w:w="60" w:type="dxa"/>
+              <w:bottom w:w="40" w:type="dxa"/>
+              <w:right w:w="60" w:type="dxa"/>
+            </w:tcMar>
+            <w:tcBorders>
+              <w:top w:val="single" w:sz="4" w:space="0" w:color="8AA0B4"/>
+              <w:left w:val="single" w:sz="4" w:space="0" w:color="8AA0B4"/>
+              <w:bottom w:val="single" w:sz="4" w:space="0" w:color="8AA0B4"/>
+              <w:right w:val="single" w:sz="4" w:space="0" w:color="8AA0B4"/>
+            </w:tcBorders>
+            <w:shd w:fill="82C785" w:val="clear"/>
+          </w:tcPr>
+          <w:p>
+            <w:pPr>
+              <w:spacing w:before="0" w:after="0" w:line="252" w:lineRule="auto"/>
+              <w:jc w:val="center"/>
+            </w:pPr>
+            <w:r/>
+            <w:r>
+              <w:rPr>
+                <w:rFonts w:ascii="Calibri" w:hAnsi="Calibri" w:eastAsia="Calibri"/>
+                <w:b/>
+                <w:color w:val="1A1A1A"/>
+                <w:sz w:val="16"/>
+              </w:rPr>
+              <w:t>Yes — VPN / remote; spare workstation</w:t>
             </w:r>
           </w:p>
         </w:tc>
@@ -1049,42 +1022,7 @@
               <w:bottom w:val="single" w:sz="4" w:space="0" w:color="8AA0B4"/>
               <w:right w:val="single" w:sz="4" w:space="0" w:color="8AA0B4"/>
             </w:tcBorders>
-            <w:shd w:fill="F4F7FA" w:val="clear"/>
-          </w:tcPr>
-          <w:p>
-            <w:pPr>
-              <w:spacing w:before="0" w:after="0" w:line="252" w:lineRule="auto"/>
-              <w:jc w:val="left"/>
-            </w:pPr>
-            <w:r/>
-            <w:r>
-              <w:rPr>
-                <w:rFonts w:ascii="Calibri" w:hAnsi="Calibri" w:eastAsia="Calibri"/>
-                <w:b w:val="0"/>
-                <w:color w:val="1A1A1A"/>
-                <w:sz w:val="16"/>
-              </w:rPr>
-              <w:t>Application source; uncommitted local work; coding standards</w:t>
-            </w:r>
-          </w:p>
-        </w:tc>
-        <w:tc>
-          <w:tcPr>
-            <w:tcW w:type="dxa" w:w="2381"/>
-            <w:vAlign w:val="center"/>
-            <w:tcMar>
-              <w:top w:w="40" w:type="dxa"/>
-              <w:left w:w="60" w:type="dxa"/>
-              <w:bottom w:w="40" w:type="dxa"/>
-              <w:right w:w="60" w:type="dxa"/>
-            </w:tcMar>
-            <w:tcBorders>
-              <w:top w:val="single" w:sz="4" w:space="0" w:color="8AA0B4"/>
-              <w:left w:val="single" w:sz="4" w:space="0" w:color="8AA0B4"/>
-              <w:bottom w:val="single" w:sz="4" w:space="0" w:color="8AA0B4"/>
-              <w:right w:val="single" w:sz="4" w:space="0" w:color="8AA0B4"/>
-            </w:tcBorders>
-            <w:shd w:fill="F4F7FA" w:val="clear"/>
+            <w:shd w:fill="F4D03F" w:val="clear"/>
           </w:tcPr>
           <w:p>
             <w:pPr>
@@ -1099,42 +1037,7 @@
                 <w:color w:val="1A1A1A"/>
                 <w:sz w:val="16"/>
               </w:rPr>
-              <w:t>Lead Developer (Primary) / Senior Developer (Backup)</w:t>
-            </w:r>
-          </w:p>
-        </w:tc>
-        <w:tc>
-          <w:tcPr>
-            <w:tcW w:type="dxa" w:w="2381"/>
-            <w:vAlign w:val="center"/>
-            <w:tcMar>
-              <w:top w:w="40" w:type="dxa"/>
-              <w:left w:w="60" w:type="dxa"/>
-              <w:bottom w:w="40" w:type="dxa"/>
-              <w:right w:w="60" w:type="dxa"/>
-            </w:tcMar>
-            <w:tcBorders>
-              <w:top w:val="single" w:sz="4" w:space="0" w:color="8AA0B4"/>
-              <w:left w:val="single" w:sz="4" w:space="0" w:color="8AA0B4"/>
-              <w:bottom w:val="single" w:sz="4" w:space="0" w:color="8AA0B4"/>
-              <w:right w:val="single" w:sz="4" w:space="0" w:color="8AA0B4"/>
-            </w:tcBorders>
-            <w:shd w:fill="F4F7FA" w:val="clear"/>
-          </w:tcPr>
-          <w:p>
-            <w:pPr>
-              <w:spacing w:before="0" w:after="0" w:line="252" w:lineRule="auto"/>
-              <w:jc w:val="left"/>
-            </w:pPr>
-            <w:r/>
-            <w:r>
-              <w:rPr>
-                <w:rFonts w:ascii="Calibri" w:hAnsi="Calibri" w:eastAsia="Calibri"/>
-                <w:b w:val="0"/>
-                <w:color w:val="1A1A1A"/>
-                <w:sz w:val="16"/>
-              </w:rPr>
-              <w:t>Client ERP platform vendor (Oracle where applicable); language/runtime vendor</w:t>
+              <w:t>Partial — Senior Developer designated as backup; confirm module-level training</w:t>
             </w:r>
           </w:p>
         </w:tc>
@@ -1215,7 +1118,7 @@
         </w:tc>
         <w:tc>
           <w:tcPr>
-            <w:tcW w:type="dxa" w:w="2948"/>
+            <w:tcW w:type="dxa" w:w="3175"/>
             <w:vAlign w:val="center"/>
             <w:tcMar>
               <w:top w:w="40" w:type="dxa"/>
@@ -1244,13 +1147,13 @@
                 <w:color w:val="1A1A1A"/>
                 <w:sz w:val="16"/>
               </w:rPr>
-              <w:t>Identity/directory so staff can authenticate; network access to the repository</w:t>
+              <w:t>The source control platform itself; sole repository administrator; vendor outage</w:t>
             </w:r>
           </w:p>
         </w:tc>
         <w:tc>
           <w:tcPr>
-            <w:tcW w:type="dxa" w:w="2835"/>
+            <w:tcW w:type="dxa" w:w="3175"/>
             <w:vAlign w:val="center"/>
             <w:tcMar>
               <w:top w:w="40" w:type="dxa"/>
@@ -1279,13 +1182,13 @@
                 <w:color w:val="1A1A1A"/>
                 <w:sz w:val="16"/>
               </w:rPr>
-              <w:t>Application Development; Code Review; Build Management; CI/CD; Release Deployment — the whole delivery path</w:t>
+              <w:t>Access control and segregation of duties on merges; commit history as the audit trail</w:t>
             </w:r>
           </w:p>
         </w:tc>
         <w:tc>
           <w:tcPr>
-            <w:tcW w:type="dxa" w:w="2494"/>
+            <w:tcW w:type="dxa" w:w="3515"/>
             <w:vAlign w:val="center"/>
             <w:tcMar>
               <w:top w:w="40" w:type="dxa"/>
@@ -1314,7 +1217,42 @@
                 <w:color w:val="1A1A1A"/>
                 <w:sz w:val="16"/>
               </w:rPr>
-              <w:t>Source control platform</w:t>
+              <w:t>Restore the repository from platform/vendor backup; freeze merges until the last good copy is verified</w:t>
+            </w:r>
+          </w:p>
+        </w:tc>
+        <w:tc>
+          <w:tcPr>
+            <w:tcW w:type="dxa" w:w="2268"/>
+            <w:vAlign w:val="center"/>
+            <w:tcMar>
+              <w:top w:w="40" w:type="dxa"/>
+              <w:left w:w="60" w:type="dxa"/>
+              <w:bottom w:w="40" w:type="dxa"/>
+              <w:right w:w="60" w:type="dxa"/>
+            </w:tcMar>
+            <w:tcBorders>
+              <w:top w:val="single" w:sz="4" w:space="0" w:color="8AA0B4"/>
+              <w:left w:val="single" w:sz="4" w:space="0" w:color="8AA0B4"/>
+              <w:bottom w:val="single" w:sz="4" w:space="0" w:color="8AA0B4"/>
+              <w:right w:val="single" w:sz="4" w:space="0" w:color="8AA0B4"/>
+            </w:tcBorders>
+            <w:shd w:fill="82C785" w:val="clear"/>
+          </w:tcPr>
+          <w:p>
+            <w:pPr>
+              <w:spacing w:before="0" w:after="0" w:line="252" w:lineRule="auto"/>
+              <w:jc w:val="center"/>
+            </w:pPr>
+            <w:r/>
+            <w:r>
+              <w:rPr>
+                <w:rFonts w:ascii="Calibri" w:hAnsi="Calibri" w:eastAsia="Calibri"/>
+                <w:b/>
+                <w:color w:val="1A1A1A"/>
+                <w:sz w:val="16"/>
+              </w:rPr>
+              <w:t>Yes — VPN to the platform; use the vendor’s alternate region if contracted</w:t>
             </w:r>
           </w:p>
         </w:tc>
@@ -1334,42 +1272,7 @@
               <w:bottom w:val="single" w:sz="4" w:space="0" w:color="8AA0B4"/>
               <w:right w:val="single" w:sz="4" w:space="0" w:color="8AA0B4"/>
             </w:tcBorders>
-            <w:shd w:fill="FFFFFF" w:val="clear"/>
-          </w:tcPr>
-          <w:p>
-            <w:pPr>
-              <w:spacing w:before="0" w:after="0" w:line="252" w:lineRule="auto"/>
-              <w:jc w:val="left"/>
-            </w:pPr>
-            <w:r/>
-            <w:r>
-              <w:rPr>
-                <w:rFonts w:ascii="Calibri" w:hAnsi="Calibri" w:eastAsia="Calibri"/>
-                <w:b w:val="0"/>
-                <w:color w:val="1A1A1A"/>
-                <w:sz w:val="16"/>
-              </w:rPr>
-              <w:t>Repositories; commit history; branch permissions; merge and approval records</w:t>
-            </w:r>
-          </w:p>
-        </w:tc>
-        <w:tc>
-          <w:tcPr>
-            <w:tcW w:type="dxa" w:w="2381"/>
-            <w:vAlign w:val="center"/>
-            <w:tcMar>
-              <w:top w:w="40" w:type="dxa"/>
-              <w:left w:w="60" w:type="dxa"/>
-              <w:bottom w:w="40" w:type="dxa"/>
-              <w:right w:w="60" w:type="dxa"/>
-            </w:tcMar>
-            <w:tcBorders>
-              <w:top w:val="single" w:sz="4" w:space="0" w:color="8AA0B4"/>
-              <w:left w:val="single" w:sz="4" w:space="0" w:color="8AA0B4"/>
-              <w:bottom w:val="single" w:sz="4" w:space="0" w:color="8AA0B4"/>
-              <w:right w:val="single" w:sz="4" w:space="0" w:color="8AA0B4"/>
-            </w:tcBorders>
-            <w:shd w:fill="FFFFFF" w:val="clear"/>
+            <w:shd w:fill="F4D03F" w:val="clear"/>
           </w:tcPr>
           <w:p>
             <w:pPr>
@@ -1384,42 +1287,7 @@
                 <w:color w:val="1A1A1A"/>
                 <w:sz w:val="16"/>
               </w:rPr>
-              <w:t>Technical Lead (Primary) / Senior Developer (Backup)</w:t>
-            </w:r>
-          </w:p>
-        </w:tc>
-        <w:tc>
-          <w:tcPr>
-            <w:tcW w:type="dxa" w:w="2381"/>
-            <w:vAlign w:val="center"/>
-            <w:tcMar>
-              <w:top w:w="40" w:type="dxa"/>
-              <w:left w:w="60" w:type="dxa"/>
-              <w:bottom w:w="40" w:type="dxa"/>
-              <w:right w:w="60" w:type="dxa"/>
-            </w:tcMar>
-            <w:tcBorders>
-              <w:top w:val="single" w:sz="4" w:space="0" w:color="8AA0B4"/>
-              <w:left w:val="single" w:sz="4" w:space="0" w:color="8AA0B4"/>
-              <w:bottom w:val="single" w:sz="4" w:space="0" w:color="8AA0B4"/>
-              <w:right w:val="single" w:sz="4" w:space="0" w:color="8AA0B4"/>
-            </w:tcBorders>
-            <w:shd w:fill="FFFFFF" w:val="clear"/>
-          </w:tcPr>
-          <w:p>
-            <w:pPr>
-              <w:spacing w:before="0" w:after="0" w:line="252" w:lineRule="auto"/>
-              <w:jc w:val="left"/>
-            </w:pPr>
-            <w:r/>
-            <w:r>
-              <w:rPr>
-                <w:rFonts w:ascii="Calibri" w:hAnsi="Calibri" w:eastAsia="Calibri"/>
-                <w:b w:val="0"/>
-                <w:color w:val="1A1A1A"/>
-                <w:sz w:val="16"/>
-              </w:rPr>
-              <w:t>Source control platform vendor</w:t>
+              <w:t>Partial — Senior Developer designated as deputy administrator</w:t>
             </w:r>
           </w:p>
         </w:tc>
@@ -1500,7 +1368,7 @@
         </w:tc>
         <w:tc>
           <w:tcPr>
-            <w:tcW w:type="dxa" w:w="2948"/>
+            <w:tcW w:type="dxa" w:w="3175"/>
             <w:vAlign w:val="center"/>
             <w:tcMar>
               <w:top w:w="40" w:type="dxa"/>
@@ -1529,13 +1397,13 @@
                 <w:color w:val="1A1A1A"/>
                 <w:sz w:val="16"/>
               </w:rPr>
-              <w:t>Source control; submitted change requests; coding and security standards</w:t>
+              <w:t>Technical Lead as the only reviewer (self-approval risk if that person is also the author)</w:t>
             </w:r>
           </w:p>
         </w:tc>
         <w:tc>
           <w:tcPr>
-            <w:tcW w:type="dxa" w:w="2835"/>
+            <w:tcW w:type="dxa" w:w="3175"/>
             <w:vAlign w:val="center"/>
             <w:tcMar>
               <w:top w:w="40" w:type="dxa"/>
@@ -1564,13 +1432,13 @@
                 <w:color w:val="1A1A1A"/>
                 <w:sz w:val="16"/>
               </w:rPr>
-              <w:t>Build Management; CI/CD; Release Deployment (unreviewed changes must not ship)</w:t>
+              <w:t>No self-approval; review workflow in source control</w:t>
             </w:r>
           </w:p>
         </w:tc>
         <w:tc>
           <w:tcPr>
-            <w:tcW w:type="dxa" w:w="2494"/>
+            <w:tcW w:type="dxa" w:w="3515"/>
             <w:vAlign w:val="center"/>
             <w:tcMar>
               <w:top w:w="40" w:type="dxa"/>
@@ -1599,7 +1467,42 @@
                 <w:color w:val="1A1A1A"/>
                 <w:sz w:val="16"/>
               </w:rPr>
-              <w:t>Source control review workflow</w:t>
+              <w:t>Senior Developer reviews; if both reviewers are unavailable, freeze merges — do not skip review</w:t>
+            </w:r>
+          </w:p>
+        </w:tc>
+        <w:tc>
+          <w:tcPr>
+            <w:tcW w:type="dxa" w:w="2268"/>
+            <w:vAlign w:val="center"/>
+            <w:tcMar>
+              <w:top w:w="40" w:type="dxa"/>
+              <w:left w:w="60" w:type="dxa"/>
+              <w:bottom w:w="40" w:type="dxa"/>
+              <w:right w:w="60" w:type="dxa"/>
+            </w:tcMar>
+            <w:tcBorders>
+              <w:top w:val="single" w:sz="4" w:space="0" w:color="8AA0B4"/>
+              <w:left w:val="single" w:sz="4" w:space="0" w:color="8AA0B4"/>
+              <w:bottom w:val="single" w:sz="4" w:space="0" w:color="8AA0B4"/>
+              <w:right w:val="single" w:sz="4" w:space="0" w:color="8AA0B4"/>
+            </w:tcBorders>
+            <w:shd w:fill="82C785" w:val="clear"/>
+          </w:tcPr>
+          <w:p>
+            <w:pPr>
+              <w:spacing w:before="0" w:after="0" w:line="252" w:lineRule="auto"/>
+              <w:jc w:val="center"/>
+            </w:pPr>
+            <w:r/>
+            <w:r>
+              <w:rPr>
+                <w:rFonts w:ascii="Calibri" w:hAnsi="Calibri" w:eastAsia="Calibri"/>
+                <w:b/>
+                <w:color w:val="1A1A1A"/>
+                <w:sz w:val="16"/>
+              </w:rPr>
+              <w:t>Yes — VPN / remote</w:t>
             </w:r>
           </w:p>
         </w:tc>
@@ -1619,42 +1522,7 @@
               <w:bottom w:val="single" w:sz="4" w:space="0" w:color="8AA0B4"/>
               <w:right w:val="single" w:sz="4" w:space="0" w:color="8AA0B4"/>
             </w:tcBorders>
-            <w:shd w:fill="F4F7FA" w:val="clear"/>
-          </w:tcPr>
-          <w:p>
-            <w:pPr>
-              <w:spacing w:before="0" w:after="0" w:line="252" w:lineRule="auto"/>
-              <w:jc w:val="left"/>
-            </w:pPr>
-            <w:r/>
-            <w:r>
-              <w:rPr>
-                <w:rFonts w:ascii="Calibri" w:hAnsi="Calibri" w:eastAsia="Calibri"/>
-                <w:b w:val="0"/>
-                <w:color w:val="1A1A1A"/>
-                <w:sz w:val="16"/>
-              </w:rPr>
-              <w:t>Review comments; approval records; defect and vulnerability findings</w:t>
-            </w:r>
-          </w:p>
-        </w:tc>
-        <w:tc>
-          <w:tcPr>
-            <w:tcW w:type="dxa" w:w="2381"/>
-            <w:vAlign w:val="center"/>
-            <w:tcMar>
-              <w:top w:w="40" w:type="dxa"/>
-              <w:left w:w="60" w:type="dxa"/>
-              <w:bottom w:w="40" w:type="dxa"/>
-              <w:right w:w="60" w:type="dxa"/>
-            </w:tcMar>
-            <w:tcBorders>
-              <w:top w:val="single" w:sz="4" w:space="0" w:color="8AA0B4"/>
-              <w:left w:val="single" w:sz="4" w:space="0" w:color="8AA0B4"/>
-              <w:bottom w:val="single" w:sz="4" w:space="0" w:color="8AA0B4"/>
-              <w:right w:val="single" w:sz="4" w:space="0" w:color="8AA0B4"/>
-            </w:tcBorders>
-            <w:shd w:fill="F4F7FA" w:val="clear"/>
+            <w:shd w:fill="F4D03F" w:val="clear"/>
           </w:tcPr>
           <w:p>
             <w:pPr>
@@ -1669,42 +1537,7 @@
                 <w:color w:val="1A1A1A"/>
                 <w:sz w:val="16"/>
               </w:rPr>
-              <w:t>Technical Lead (Primary) / Senior Developer (Backup)</w:t>
-            </w:r>
-          </w:p>
-        </w:tc>
-        <w:tc>
-          <w:tcPr>
-            <w:tcW w:type="dxa" w:w="2381"/>
-            <w:vAlign w:val="center"/>
-            <w:tcMar>
-              <w:top w:w="40" w:type="dxa"/>
-              <w:left w:w="60" w:type="dxa"/>
-              <w:bottom w:w="40" w:type="dxa"/>
-              <w:right w:w="60" w:type="dxa"/>
-            </w:tcMar>
-            <w:tcBorders>
-              <w:top w:val="single" w:sz="4" w:space="0" w:color="8AA0B4"/>
-              <w:left w:val="single" w:sz="4" w:space="0" w:color="8AA0B4"/>
-              <w:bottom w:val="single" w:sz="4" w:space="0" w:color="8AA0B4"/>
-              <w:right w:val="single" w:sz="4" w:space="0" w:color="8AA0B4"/>
-            </w:tcBorders>
-            <w:shd w:fill="F4F7FA" w:val="clear"/>
-          </w:tcPr>
-          <w:p>
-            <w:pPr>
-              <w:spacing w:before="0" w:after="0" w:line="252" w:lineRule="auto"/>
-              <w:jc w:val="left"/>
-            </w:pPr>
-            <w:r/>
-            <w:r>
-              <w:rPr>
-                <w:rFonts w:ascii="Calibri" w:hAnsi="Calibri" w:eastAsia="Calibri"/>
-                <w:b w:val="0"/>
-                <w:color w:val="1A1A1A"/>
-                <w:sz w:val="16"/>
-              </w:rPr>
-              <w:t>Source control platform vendor</w:t>
+              <w:t>Partial — Senior Developer designated as backup reviewer</w:t>
             </w:r>
           </w:p>
         </w:tc>
@@ -1785,7 +1618,7 @@
         </w:tc>
         <w:tc>
           <w:tcPr>
-            <w:tcW w:type="dxa" w:w="2948"/>
+            <w:tcW w:type="dxa" w:w="3175"/>
             <w:vAlign w:val="center"/>
             <w:tcMar>
               <w:top w:w="40" w:type="dxa"/>
@@ -1814,13 +1647,13 @@
                 <w:color w:val="1A1A1A"/>
                 <w:sz w:val="16"/>
               </w:rPr>
-              <w:t>Testable build; requirements/acceptance criteria; test or staging environment; Implementation Functional Unit business scenarios</w:t>
+              <w:t>QA Lead; a single test/staging environment</w:t>
             </w:r>
           </w:p>
         </w:tc>
         <w:tc>
           <w:tcPr>
-            <w:tcW w:type="dxa" w:w="2835"/>
+            <w:tcW w:type="dxa" w:w="3175"/>
             <w:vAlign w:val="center"/>
             <w:tcMar>
               <w:top w:w="40" w:type="dxa"/>
@@ -1849,13 +1682,13 @@
                 <w:color w:val="1A1A1A"/>
                 <w:sz w:val="16"/>
               </w:rPr>
-              <w:t>Release Management; Release Deployment; client go-live confidence</w:t>
+              <w:t>Written test cases; defect logging in the ticketing portal; Functional Unit business scenarios</w:t>
             </w:r>
           </w:p>
         </w:tc>
         <w:tc>
           <w:tcPr>
-            <w:tcW w:type="dxa" w:w="2494"/>
+            <w:tcW w:type="dxa" w:w="3515"/>
             <w:vAlign w:val="center"/>
             <w:tcMar>
               <w:top w:w="40" w:type="dxa"/>
@@ -1884,7 +1717,42 @@
                 <w:color w:val="1A1A1A"/>
                 <w:sz w:val="16"/>
               </w:rPr>
-              <w:t>Test/staging environment; ticketing portal (defects); VPN</w:t>
+              <w:t>Functional Tester continues from written cases; restore or rebuild staging from the environment baseline</w:t>
+            </w:r>
+          </w:p>
+        </w:tc>
+        <w:tc>
+          <w:tcPr>
+            <w:tcW w:type="dxa" w:w="2268"/>
+            <w:vAlign w:val="center"/>
+            <w:tcMar>
+              <w:top w:w="40" w:type="dxa"/>
+              <w:left w:w="60" w:type="dxa"/>
+              <w:bottom w:w="40" w:type="dxa"/>
+              <w:right w:w="60" w:type="dxa"/>
+            </w:tcMar>
+            <w:tcBorders>
+              <w:top w:val="single" w:sz="4" w:space="0" w:color="8AA0B4"/>
+              <w:left w:val="single" w:sz="4" w:space="0" w:color="8AA0B4"/>
+              <w:bottom w:val="single" w:sz="4" w:space="0" w:color="8AA0B4"/>
+              <w:right w:val="single" w:sz="4" w:space="0" w:color="8AA0B4"/>
+            </w:tcBorders>
+            <w:shd w:fill="82C785" w:val="clear"/>
+          </w:tcPr>
+          <w:p>
+            <w:pPr>
+              <w:spacing w:before="0" w:after="0" w:line="252" w:lineRule="auto"/>
+              <w:jc w:val="center"/>
+            </w:pPr>
+            <w:r/>
+            <w:r>
+              <w:rPr>
+                <w:rFonts w:ascii="Calibri" w:hAnsi="Calibri" w:eastAsia="Calibri"/>
+                <w:b/>
+                <w:color w:val="1A1A1A"/>
+                <w:sz w:val="16"/>
+              </w:rPr>
+              <w:t>Yes — VPN to test/staging</w:t>
             </w:r>
           </w:p>
         </w:tc>
@@ -1904,42 +1772,7 @@
               <w:bottom w:val="single" w:sz="4" w:space="0" w:color="8AA0B4"/>
               <w:right w:val="single" w:sz="4" w:space="0" w:color="8AA0B4"/>
             </w:tcBorders>
-            <w:shd w:fill="FFFFFF" w:val="clear"/>
-          </w:tcPr>
-          <w:p>
-            <w:pPr>
-              <w:spacing w:before="0" w:after="0" w:line="252" w:lineRule="auto"/>
-              <w:jc w:val="left"/>
-            </w:pPr>
-            <w:r/>
-            <w:r>
-              <w:rPr>
-                <w:rFonts w:ascii="Calibri" w:hAnsi="Calibri" w:eastAsia="Calibri"/>
-                <w:b w:val="0"/>
-                <w:color w:val="1A1A1A"/>
-                <w:sz w:val="16"/>
-              </w:rPr>
-              <w:t>Test cases; test results; defect logs; sign-off records</w:t>
-            </w:r>
-          </w:p>
-        </w:tc>
-        <w:tc>
-          <w:tcPr>
-            <w:tcW w:type="dxa" w:w="2381"/>
-            <w:vAlign w:val="center"/>
-            <w:tcMar>
-              <w:top w:w="40" w:type="dxa"/>
-              <w:left w:w="60" w:type="dxa"/>
-              <w:bottom w:w="40" w:type="dxa"/>
-              <w:right w:w="60" w:type="dxa"/>
-            </w:tcMar>
-            <w:tcBorders>
-              <w:top w:val="single" w:sz="4" w:space="0" w:color="8AA0B4"/>
-              <w:left w:val="single" w:sz="4" w:space="0" w:color="8AA0B4"/>
-              <w:bottom w:val="single" w:sz="4" w:space="0" w:color="8AA0B4"/>
-              <w:right w:val="single" w:sz="4" w:space="0" w:color="8AA0B4"/>
-            </w:tcBorders>
-            <w:shd w:fill="FFFFFF" w:val="clear"/>
+            <w:shd w:fill="F4D03F" w:val="clear"/>
           </w:tcPr>
           <w:p>
             <w:pPr>
@@ -1954,42 +1787,7 @@
                 <w:color w:val="1A1A1A"/>
                 <w:sz w:val="16"/>
               </w:rPr>
-              <w:t>QA Lead (Primary) / Functional Tester (Backup)</w:t>
-            </w:r>
-          </w:p>
-        </w:tc>
-        <w:tc>
-          <w:tcPr>
-            <w:tcW w:type="dxa" w:w="2381"/>
-            <w:vAlign w:val="center"/>
-            <w:tcMar>
-              <w:top w:w="40" w:type="dxa"/>
-              <w:left w:w="60" w:type="dxa"/>
-              <w:bottom w:w="40" w:type="dxa"/>
-              <w:right w:w="60" w:type="dxa"/>
-            </w:tcMar>
-            <w:tcBorders>
-              <w:top w:val="single" w:sz="4" w:space="0" w:color="8AA0B4"/>
-              <w:left w:val="single" w:sz="4" w:space="0" w:color="8AA0B4"/>
-              <w:bottom w:val="single" w:sz="4" w:space="0" w:color="8AA0B4"/>
-              <w:right w:val="single" w:sz="4" w:space="0" w:color="8AA0B4"/>
-            </w:tcBorders>
-            <w:shd w:fill="FFFFFF" w:val="clear"/>
-          </w:tcPr>
-          <w:p>
-            <w:pPr>
-              <w:spacing w:before="0" w:after="0" w:line="252" w:lineRule="auto"/>
-              <w:jc w:val="left"/>
-            </w:pPr>
-            <w:r/>
-            <w:r>
-              <w:rPr>
-                <w:rFonts w:ascii="Calibri" w:hAnsi="Calibri" w:eastAsia="Calibri"/>
-                <w:b w:val="0"/>
-                <w:color w:val="1A1A1A"/>
-                <w:sz w:val="16"/>
-              </w:rPr>
-              <w:t>Hosting/cloud provider (test environments)</w:t>
+              <w:t>Partial — Functional Tester designated as backup</w:t>
             </w:r>
           </w:p>
         </w:tc>
@@ -2070,7 +1868,7 @@
         </w:tc>
         <w:tc>
           <w:tcPr>
-            <w:tcW w:type="dxa" w:w="2948"/>
+            <w:tcW w:type="dxa" w:w="3175"/>
             <w:vAlign w:val="center"/>
             <w:tcMar>
               <w:top w:w="40" w:type="dxa"/>
@@ -2099,13 +1897,13 @@
                 <w:color w:val="1A1A1A"/>
                 <w:sz w:val="16"/>
               </w:rPr>
-              <w:t>Approved code in source control; dependency/artefact store; build configuration</w:t>
+              <w:t>Build server; DevOps Engineer; artefact store</w:t>
             </w:r>
           </w:p>
         </w:tc>
         <w:tc>
           <w:tcPr>
-            <w:tcW w:type="dxa" w:w="2835"/>
+            <w:tcW w:type="dxa" w:w="3175"/>
             <w:vAlign w:val="center"/>
             <w:tcMar>
               <w:top w:w="40" w:type="dxa"/>
@@ -2134,13 +1932,13 @@
                 <w:color w:val="1A1A1A"/>
                 <w:sz w:val="16"/>
               </w:rPr>
-              <w:t>CI/CD Pipeline; Release Deployment</w:t>
+              <w:t>Build definitions in source control; versioned artefacts</w:t>
             </w:r>
           </w:p>
         </w:tc>
         <w:tc>
           <w:tcPr>
-            <w:tcW w:type="dxa" w:w="2494"/>
+            <w:tcW w:type="dxa" w:w="3515"/>
             <w:vAlign w:val="center"/>
             <w:tcMar>
               <w:top w:w="40" w:type="dxa"/>
@@ -2169,7 +1967,42 @@
                 <w:color w:val="1A1A1A"/>
                 <w:sz w:val="16"/>
               </w:rPr>
-              <w:t>Build server; artefact repository; source control</w:t>
+              <w:t>Rebuild the build host from definitions in source control; Technical Lead runs a known-good build</w:t>
+            </w:r>
+          </w:p>
+        </w:tc>
+        <w:tc>
+          <w:tcPr>
+            <w:tcW w:type="dxa" w:w="2268"/>
+            <w:vAlign w:val="center"/>
+            <w:tcMar>
+              <w:top w:w="40" w:type="dxa"/>
+              <w:left w:w="60" w:type="dxa"/>
+              <w:bottom w:w="40" w:type="dxa"/>
+              <w:right w:w="60" w:type="dxa"/>
+            </w:tcMar>
+            <w:tcBorders>
+              <w:top w:val="single" w:sz="4" w:space="0" w:color="8AA0B4"/>
+              <w:left w:val="single" w:sz="4" w:space="0" w:color="8AA0B4"/>
+              <w:bottom w:val="single" w:sz="4" w:space="0" w:color="8AA0B4"/>
+              <w:right w:val="single" w:sz="4" w:space="0" w:color="8AA0B4"/>
+            </w:tcBorders>
+            <w:shd w:fill="82C785" w:val="clear"/>
+          </w:tcPr>
+          <w:p>
+            <w:pPr>
+              <w:spacing w:before="0" w:after="0" w:line="252" w:lineRule="auto"/>
+              <w:jc w:val="center"/>
+            </w:pPr>
+            <w:r/>
+            <w:r>
+              <w:rPr>
+                <w:rFonts w:ascii="Calibri" w:hAnsi="Calibri" w:eastAsia="Calibri"/>
+                <w:b/>
+                <w:color w:val="1A1A1A"/>
+                <w:sz w:val="16"/>
+              </w:rPr>
+              <w:t>Yes — VPN / remote; rebuild on an alternate host</w:t>
             </w:r>
           </w:p>
         </w:tc>
@@ -2189,42 +2022,7 @@
               <w:bottom w:val="single" w:sz="4" w:space="0" w:color="8AA0B4"/>
               <w:right w:val="single" w:sz="4" w:space="0" w:color="8AA0B4"/>
             </w:tcBorders>
-            <w:shd w:fill="F4F7FA" w:val="clear"/>
-          </w:tcPr>
-          <w:p>
-            <w:pPr>
-              <w:spacing w:before="0" w:after="0" w:line="252" w:lineRule="auto"/>
-              <w:jc w:val="left"/>
-            </w:pPr>
-            <w:r/>
-            <w:r>
-              <w:rPr>
-                <w:rFonts w:ascii="Calibri" w:hAnsi="Calibri" w:eastAsia="Calibri"/>
-                <w:b w:val="0"/>
-                <w:color w:val="1A1A1A"/>
-                <w:sz w:val="16"/>
-              </w:rPr>
-              <w:t>Build definitions; build logs; versioned artefacts; dependency lockfiles</w:t>
-            </w:r>
-          </w:p>
-        </w:tc>
-        <w:tc>
-          <w:tcPr>
-            <w:tcW w:type="dxa" w:w="2381"/>
-            <w:vAlign w:val="center"/>
-            <w:tcMar>
-              <w:top w:w="40" w:type="dxa"/>
-              <w:left w:w="60" w:type="dxa"/>
-              <w:bottom w:w="40" w:type="dxa"/>
-              <w:right w:w="60" w:type="dxa"/>
-            </w:tcMar>
-            <w:tcBorders>
-              <w:top w:val="single" w:sz="4" w:space="0" w:color="8AA0B4"/>
-              <w:left w:val="single" w:sz="4" w:space="0" w:color="8AA0B4"/>
-              <w:bottom w:val="single" w:sz="4" w:space="0" w:color="8AA0B4"/>
-              <w:right w:val="single" w:sz="4" w:space="0" w:color="8AA0B4"/>
-            </w:tcBorders>
-            <w:shd w:fill="F4F7FA" w:val="clear"/>
+            <w:shd w:fill="F4D03F" w:val="clear"/>
           </w:tcPr>
           <w:p>
             <w:pPr>
@@ -2239,42 +2037,7 @@
                 <w:color w:val="1A1A1A"/>
                 <w:sz w:val="16"/>
               </w:rPr>
-              <w:t>DevOps Engineer (Primary) / Technical Lead (Backup)</w:t>
-            </w:r>
-          </w:p>
-        </w:tc>
-        <w:tc>
-          <w:tcPr>
-            <w:tcW w:type="dxa" w:w="2381"/>
-            <w:vAlign w:val="center"/>
-            <w:tcMar>
-              <w:top w:w="40" w:type="dxa"/>
-              <w:left w:w="60" w:type="dxa"/>
-              <w:bottom w:w="40" w:type="dxa"/>
-              <w:right w:w="60" w:type="dxa"/>
-            </w:tcMar>
-            <w:tcBorders>
-              <w:top w:val="single" w:sz="4" w:space="0" w:color="8AA0B4"/>
-              <w:left w:val="single" w:sz="4" w:space="0" w:color="8AA0B4"/>
-              <w:bottom w:val="single" w:sz="4" w:space="0" w:color="8AA0B4"/>
-              <w:right w:val="single" w:sz="4" w:space="0" w:color="8AA0B4"/>
-            </w:tcBorders>
-            <w:shd w:fill="F4F7FA" w:val="clear"/>
-          </w:tcPr>
-          <w:p>
-            <w:pPr>
-              <w:spacing w:before="0" w:after="0" w:line="252" w:lineRule="auto"/>
-              <w:jc w:val="left"/>
-            </w:pPr>
-            <w:r/>
-            <w:r>
-              <w:rPr>
-                <w:rFonts w:ascii="Calibri" w:hAnsi="Calibri" w:eastAsia="Calibri"/>
-                <w:b w:val="0"/>
-                <w:color w:val="1A1A1A"/>
-                <w:sz w:val="16"/>
-              </w:rPr>
-              <w:t>Build and artefact platform vendor</w:t>
+              <w:t>Partial — Technical Lead designated as backup</w:t>
             </w:r>
           </w:p>
         </w:tc>
@@ -2355,7 +2118,7 @@
         </w:tc>
         <w:tc>
           <w:tcPr>
-            <w:tcW w:type="dxa" w:w="2948"/>
+            <w:tcW w:type="dxa" w:w="3175"/>
             <w:vAlign w:val="center"/>
             <w:tcMar>
               <w:top w:w="40" w:type="dxa"/>
@@ -2384,13 +2147,13 @@
                 <w:color w:val="1A1A1A"/>
                 <w:sz w:val="16"/>
               </w:rPr>
-              <w:t>Build artefacts; pipeline definitions; environment credentials; change/release approval</w:t>
+              <w:t>CI/CD platform; pipeline administrator; production deploy credentials</w:t>
             </w:r>
           </w:p>
         </w:tc>
         <w:tc>
           <w:tcPr>
-            <w:tcW w:type="dxa" w:w="2835"/>
+            <w:tcW w:type="dxa" w:w="3175"/>
             <w:vAlign w:val="center"/>
             <w:tcMar>
               <w:top w:w="40" w:type="dxa"/>
@@ -2419,13 +2182,13 @@
                 <w:color w:val="1A1A1A"/>
                 <w:sz w:val="16"/>
               </w:rPr>
-              <w:t>Release Deployment; Production Support (what actually lands in production)</w:t>
+              <w:t>Approval gates; pipeline configuration in source control</w:t>
             </w:r>
           </w:p>
         </w:tc>
         <w:tc>
           <w:tcPr>
-            <w:tcW w:type="dxa" w:w="2494"/>
+            <w:tcW w:type="dxa" w:w="3515"/>
             <w:vAlign w:val="center"/>
             <w:tcMar>
               <w:top w:w="40" w:type="dxa"/>
@@ -2454,7 +2217,42 @@
                 <w:color w:val="1A1A1A"/>
                 <w:sz w:val="16"/>
               </w:rPr>
-              <w:t>CI/CD platform; source control; target environments</w:t>
+              <w:t>Restore pipelines from source-controlled config; manual deploy only with dual control if the platform is down</w:t>
+            </w:r>
+          </w:p>
+        </w:tc>
+        <w:tc>
+          <w:tcPr>
+            <w:tcW w:type="dxa" w:w="2268"/>
+            <w:vAlign w:val="center"/>
+            <w:tcMar>
+              <w:top w:w="40" w:type="dxa"/>
+              <w:left w:w="60" w:type="dxa"/>
+              <w:bottom w:w="40" w:type="dxa"/>
+              <w:right w:w="60" w:type="dxa"/>
+            </w:tcMar>
+            <w:tcBorders>
+              <w:top w:val="single" w:sz="4" w:space="0" w:color="8AA0B4"/>
+              <w:left w:val="single" w:sz="4" w:space="0" w:color="8AA0B4"/>
+              <w:bottom w:val="single" w:sz="4" w:space="0" w:color="8AA0B4"/>
+              <w:right w:val="single" w:sz="4" w:space="0" w:color="8AA0B4"/>
+            </w:tcBorders>
+            <w:shd w:fill="82C785" w:val="clear"/>
+          </w:tcPr>
+          <w:p>
+            <w:pPr>
+              <w:spacing w:before="0" w:after="0" w:line="252" w:lineRule="auto"/>
+              <w:jc w:val="center"/>
+            </w:pPr>
+            <w:r/>
+            <w:r>
+              <w:rPr>
+                <w:rFonts w:ascii="Calibri" w:hAnsi="Calibri" w:eastAsia="Calibri"/>
+                <w:b/>
+                <w:color w:val="1A1A1A"/>
+                <w:sz w:val="16"/>
+              </w:rPr>
+              <w:t>Yes — VPN / remote; alternate runner if needed</w:t>
             </w:r>
           </w:p>
         </w:tc>
@@ -2474,42 +2272,7 @@
               <w:bottom w:val="single" w:sz="4" w:space="0" w:color="8AA0B4"/>
               <w:right w:val="single" w:sz="4" w:space="0" w:color="8AA0B4"/>
             </w:tcBorders>
-            <w:shd w:fill="FFFFFF" w:val="clear"/>
-          </w:tcPr>
-          <w:p>
-            <w:pPr>
-              <w:spacing w:before="0" w:after="0" w:line="252" w:lineRule="auto"/>
-              <w:jc w:val="left"/>
-            </w:pPr>
-            <w:r/>
-            <w:r>
-              <w:rPr>
-                <w:rFonts w:ascii="Calibri" w:hAnsi="Calibri" w:eastAsia="Calibri"/>
-                <w:b w:val="0"/>
-                <w:color w:val="1A1A1A"/>
-                <w:sz w:val="16"/>
-              </w:rPr>
-              <w:t>Pipeline configuration; deployment logs; approval-gate records</w:t>
-            </w:r>
-          </w:p>
-        </w:tc>
-        <w:tc>
-          <w:tcPr>
-            <w:tcW w:type="dxa" w:w="2381"/>
-            <w:vAlign w:val="center"/>
-            <w:tcMar>
-              <w:top w:w="40" w:type="dxa"/>
-              <w:left w:w="60" w:type="dxa"/>
-              <w:bottom w:w="40" w:type="dxa"/>
-              <w:right w:w="60" w:type="dxa"/>
-            </w:tcMar>
-            <w:tcBorders>
-              <w:top w:val="single" w:sz="4" w:space="0" w:color="8AA0B4"/>
-              <w:left w:val="single" w:sz="4" w:space="0" w:color="8AA0B4"/>
-              <w:bottom w:val="single" w:sz="4" w:space="0" w:color="8AA0B4"/>
-              <w:right w:val="single" w:sz="4" w:space="0" w:color="8AA0B4"/>
-            </w:tcBorders>
-            <w:shd w:fill="FFFFFF" w:val="clear"/>
+            <w:shd w:fill="F4D03F" w:val="clear"/>
           </w:tcPr>
           <w:p>
             <w:pPr>
@@ -2524,42 +2287,7 @@
                 <w:color w:val="1A1A1A"/>
                 <w:sz w:val="16"/>
               </w:rPr>
-              <w:t>DevOps Engineer (Primary) / Technical Lead (Backup)</w:t>
-            </w:r>
-          </w:p>
-        </w:tc>
-        <w:tc>
-          <w:tcPr>
-            <w:tcW w:type="dxa" w:w="2381"/>
-            <w:vAlign w:val="center"/>
-            <w:tcMar>
-              <w:top w:w="40" w:type="dxa"/>
-              <w:left w:w="60" w:type="dxa"/>
-              <w:bottom w:w="40" w:type="dxa"/>
-              <w:right w:w="60" w:type="dxa"/>
-            </w:tcMar>
-            <w:tcBorders>
-              <w:top w:val="single" w:sz="4" w:space="0" w:color="8AA0B4"/>
-              <w:left w:val="single" w:sz="4" w:space="0" w:color="8AA0B4"/>
-              <w:bottom w:val="single" w:sz="4" w:space="0" w:color="8AA0B4"/>
-              <w:right w:val="single" w:sz="4" w:space="0" w:color="8AA0B4"/>
-            </w:tcBorders>
-            <w:shd w:fill="FFFFFF" w:val="clear"/>
-          </w:tcPr>
-          <w:p>
-            <w:pPr>
-              <w:spacing w:before="0" w:after="0" w:line="252" w:lineRule="auto"/>
-              <w:jc w:val="left"/>
-            </w:pPr>
-            <w:r/>
-            <w:r>
-              <w:rPr>
-                <w:rFonts w:ascii="Calibri" w:hAnsi="Calibri" w:eastAsia="Calibri"/>
-                <w:b w:val="0"/>
-                <w:color w:val="1A1A1A"/>
-                <w:sz w:val="16"/>
-              </w:rPr>
-              <w:t>CI/CD platform vendor</w:t>
+              <w:t>Partial — Technical Lead designated as backup</w:t>
             </w:r>
           </w:p>
         </w:tc>
@@ -2640,7 +2368,7 @@
         </w:tc>
         <w:tc>
           <w:tcPr>
-            <w:tcW w:type="dxa" w:w="2948"/>
+            <w:tcW w:type="dxa" w:w="3175"/>
             <w:vAlign w:val="center"/>
             <w:tcMar>
               <w:top w:w="40" w:type="dxa"/>
@@ -2669,13 +2397,13 @@
                 <w:color w:val="1A1A1A"/>
                 <w:sz w:val="16"/>
               </w:rPr>
-              <w:t>Approved release package; CI/CD or runbook; change approval; client release window; VPN to production</w:t>
+              <w:t>Release Engineer; production VPN path; the production environment itself</w:t>
             </w:r>
           </w:p>
         </w:tc>
         <w:tc>
           <w:tcPr>
-            <w:tcW w:type="dxa" w:w="2835"/>
+            <w:tcW w:type="dxa" w:w="3175"/>
             <w:vAlign w:val="center"/>
             <w:tcMar>
               <w:top w:w="40" w:type="dxa"/>
@@ -2704,13 +2432,13 @@
                 <w:color w:val="1A1A1A"/>
                 <w:sz w:val="16"/>
               </w:rPr>
-              <w:t>Business Development (promised dates); client production; Production Support; Incident Management</w:t>
+              <w:t>Change ticket; rollback plan; avoid month-end, Friday, and pre-holiday deploys</w:t>
             </w:r>
           </w:p>
         </w:tc>
         <w:tc>
           <w:tcPr>
-            <w:tcW w:type="dxa" w:w="2494"/>
+            <w:tcW w:type="dxa" w:w="3515"/>
             <w:vAlign w:val="center"/>
             <w:tcMar>
               <w:top w:w="40" w:type="dxa"/>
@@ -2739,7 +2467,42 @@
                 <w:color w:val="1A1A1A"/>
                 <w:sz w:val="16"/>
               </w:rPr>
-              <w:t>Deployment tooling; production environment; VPN; ticketing portal (change record)</w:t>
+              <w:t>Technical Lead executes the runbook; roll back to the previous package; delay any non-urgent release</w:t>
+            </w:r>
+          </w:p>
+        </w:tc>
+        <w:tc>
+          <w:tcPr>
+            <w:tcW w:type="dxa" w:w="2268"/>
+            <w:vAlign w:val="center"/>
+            <w:tcMar>
+              <w:top w:w="40" w:type="dxa"/>
+              <w:left w:w="60" w:type="dxa"/>
+              <w:bottom w:w="40" w:type="dxa"/>
+              <w:right w:w="60" w:type="dxa"/>
+            </w:tcMar>
+            <w:tcBorders>
+              <w:top w:val="single" w:sz="4" w:space="0" w:color="8AA0B4"/>
+              <w:left w:val="single" w:sz="4" w:space="0" w:color="8AA0B4"/>
+              <w:bottom w:val="single" w:sz="4" w:space="0" w:color="8AA0B4"/>
+              <w:right w:val="single" w:sz="4" w:space="0" w:color="8AA0B4"/>
+            </w:tcBorders>
+            <w:shd w:fill="82C785" w:val="clear"/>
+          </w:tcPr>
+          <w:p>
+            <w:pPr>
+              <w:spacing w:before="0" w:after="0" w:line="252" w:lineRule="auto"/>
+              <w:jc w:val="center"/>
+            </w:pPr>
+            <w:r/>
+            <w:r>
+              <w:rPr>
+                <w:rFonts w:ascii="Calibri" w:hAnsi="Calibri" w:eastAsia="Calibri"/>
+                <w:b/>
+                <w:color w:val="1A1A1A"/>
+                <w:sz w:val="16"/>
+              </w:rPr>
+              <w:t>Yes — VPN to production</w:t>
             </w:r>
           </w:p>
         </w:tc>
@@ -2759,42 +2522,7 @@
               <w:bottom w:val="single" w:sz="4" w:space="0" w:color="8AA0B4"/>
               <w:right w:val="single" w:sz="4" w:space="0" w:color="8AA0B4"/>
             </w:tcBorders>
-            <w:shd w:fill="F4F7FA" w:val="clear"/>
-          </w:tcPr>
-          <w:p>
-            <w:pPr>
-              <w:spacing w:before="0" w:after="0" w:line="252" w:lineRule="auto"/>
-              <w:jc w:val="left"/>
-            </w:pPr>
-            <w:r/>
-            <w:r>
-              <w:rPr>
-                <w:rFonts w:ascii="Calibri" w:hAnsi="Calibri" w:eastAsia="Calibri"/>
-                <w:b w:val="0"/>
-                <w:color w:val="1A1A1A"/>
-                <w:sz w:val="16"/>
-              </w:rPr>
-              <w:t>Release package; deployment runbook; change ticket; rollback plan</w:t>
-            </w:r>
-          </w:p>
-        </w:tc>
-        <w:tc>
-          <w:tcPr>
-            <w:tcW w:type="dxa" w:w="2381"/>
-            <w:vAlign w:val="center"/>
-            <w:tcMar>
-              <w:top w:w="40" w:type="dxa"/>
-              <w:left w:w="60" w:type="dxa"/>
-              <w:bottom w:w="40" w:type="dxa"/>
-              <w:right w:w="60" w:type="dxa"/>
-            </w:tcMar>
-            <w:tcBorders>
-              <w:top w:val="single" w:sz="4" w:space="0" w:color="8AA0B4"/>
-              <w:left w:val="single" w:sz="4" w:space="0" w:color="8AA0B4"/>
-              <w:bottom w:val="single" w:sz="4" w:space="0" w:color="8AA0B4"/>
-              <w:right w:val="single" w:sz="4" w:space="0" w:color="8AA0B4"/>
-            </w:tcBorders>
-            <w:shd w:fill="F4F7FA" w:val="clear"/>
+            <w:shd w:fill="F4D03F" w:val="clear"/>
           </w:tcPr>
           <w:p>
             <w:pPr>
@@ -2809,42 +2537,7 @@
                 <w:color w:val="1A1A1A"/>
                 <w:sz w:val="16"/>
               </w:rPr>
-              <w:t>Release Engineer (Primary) / Technical Lead (Backup)</w:t>
-            </w:r>
-          </w:p>
-        </w:tc>
-        <w:tc>
-          <w:tcPr>
-            <w:tcW w:type="dxa" w:w="2381"/>
-            <w:vAlign w:val="center"/>
-            <w:tcMar>
-              <w:top w:w="40" w:type="dxa"/>
-              <w:left w:w="60" w:type="dxa"/>
-              <w:bottom w:w="40" w:type="dxa"/>
-              <w:right w:w="60" w:type="dxa"/>
-            </w:tcMar>
-            <w:tcBorders>
-              <w:top w:val="single" w:sz="4" w:space="0" w:color="8AA0B4"/>
-              <w:left w:val="single" w:sz="4" w:space="0" w:color="8AA0B4"/>
-              <w:bottom w:val="single" w:sz="4" w:space="0" w:color="8AA0B4"/>
-              <w:right w:val="single" w:sz="4" w:space="0" w:color="8AA0B4"/>
-            </w:tcBorders>
-            <w:shd w:fill="F4F7FA" w:val="clear"/>
-          </w:tcPr>
-          <w:p>
-            <w:pPr>
-              <w:spacing w:before="0" w:after="0" w:line="252" w:lineRule="auto"/>
-              <w:jc w:val="left"/>
-            </w:pPr>
-            <w:r/>
-            <w:r>
-              <w:rPr>
-                <w:rFonts w:ascii="Calibri" w:hAnsi="Calibri" w:eastAsia="Calibri"/>
-                <w:b w:val="0"/>
-                <w:color w:val="1A1A1A"/>
-                <w:sz w:val="16"/>
-              </w:rPr>
-              <w:t>Cloud/hosting provider; Oracle Corporation (where production is Oracle ERP)</w:t>
+              <w:t>Partial — Technical Lead designated as backup</w:t>
             </w:r>
           </w:p>
         </w:tc>
@@ -2925,7 +2618,7 @@
         </w:tc>
         <w:tc>
           <w:tcPr>
-            <w:tcW w:type="dxa" w:w="2948"/>
+            <w:tcW w:type="dxa" w:w="3175"/>
             <w:vAlign w:val="center"/>
             <w:tcMar>
               <w:top w:w="40" w:type="dxa"/>
@@ -2954,13 +2647,13 @@
                 <w:color w:val="1A1A1A"/>
                 <w:sz w:val="16"/>
               </w:rPr>
-              <w:t>Approved schema/data change; backup/restore capability; VPN to the database environment</w:t>
+              <w:t>Database Administrator; the database platform; backups stored in only one place</w:t>
             </w:r>
           </w:p>
         </w:tc>
         <w:tc>
           <w:tcPr>
-            <w:tcW w:type="dxa" w:w="2835"/>
+            <w:tcW w:type="dxa" w:w="3175"/>
             <w:vAlign w:val="center"/>
             <w:tcMar>
               <w:top w:w="40" w:type="dxa"/>
@@ -2989,13 +2682,13 @@
                 <w:color w:val="1A1A1A"/>
                 <w:sz w:val="16"/>
               </w:rPr>
-              <w:t>Data Handling &amp; ETL; application features; client reporting; Production Support</w:t>
+              <w:t>Scripted changes; backup/restore; controlled access grants; VPN</w:t>
             </w:r>
           </w:p>
         </w:tc>
         <w:tc>
           <w:tcPr>
-            <w:tcW w:type="dxa" w:w="2494"/>
+            <w:tcW w:type="dxa" w:w="3515"/>
             <w:vAlign w:val="center"/>
             <w:tcMar>
               <w:top w:w="40" w:type="dxa"/>
@@ -3024,7 +2717,42 @@
                 <w:color w:val="1A1A1A"/>
                 <w:sz w:val="16"/>
               </w:rPr>
-              <w:t>Database platform; admin console; VPN; backup tooling</w:t>
+              <w:t>Restore from backup; Senior Developer applies scripted changes only; call the platform vendor if the engine is down</w:t>
+            </w:r>
+          </w:p>
+        </w:tc>
+        <w:tc>
+          <w:tcPr>
+            <w:tcW w:type="dxa" w:w="2268"/>
+            <w:vAlign w:val="center"/>
+            <w:tcMar>
+              <w:top w:w="40" w:type="dxa"/>
+              <w:left w:w="60" w:type="dxa"/>
+              <w:bottom w:w="40" w:type="dxa"/>
+              <w:right w:w="60" w:type="dxa"/>
+            </w:tcMar>
+            <w:tcBorders>
+              <w:top w:val="single" w:sz="4" w:space="0" w:color="8AA0B4"/>
+              <w:left w:val="single" w:sz="4" w:space="0" w:color="8AA0B4"/>
+              <w:bottom w:val="single" w:sz="4" w:space="0" w:color="8AA0B4"/>
+              <w:right w:val="single" w:sz="4" w:space="0" w:color="8AA0B4"/>
+            </w:tcBorders>
+            <w:shd w:fill="82C785" w:val="clear"/>
+          </w:tcPr>
+          <w:p>
+            <w:pPr>
+              <w:spacing w:before="0" w:after="0" w:line="252" w:lineRule="auto"/>
+              <w:jc w:val="center"/>
+            </w:pPr>
+            <w:r/>
+            <w:r>
+              <w:rPr>
+                <w:rFonts w:ascii="Calibri" w:hAnsi="Calibri" w:eastAsia="Calibri"/>
+                <w:b/>
+                <w:color w:val="1A1A1A"/>
+                <w:sz w:val="16"/>
+              </w:rPr>
+              <w:t>Yes — VPN; restore onto an alternate host if the primary is lost</w:t>
             </w:r>
           </w:p>
         </w:tc>
@@ -3044,42 +2772,7 @@
               <w:bottom w:val="single" w:sz="4" w:space="0" w:color="8AA0B4"/>
               <w:right w:val="single" w:sz="4" w:space="0" w:color="8AA0B4"/>
             </w:tcBorders>
-            <w:shd w:fill="FFFFFF" w:val="clear"/>
-          </w:tcPr>
-          <w:p>
-            <w:pPr>
-              <w:spacing w:before="0" w:after="0" w:line="252" w:lineRule="auto"/>
-              <w:jc w:val="left"/>
-            </w:pPr>
-            <w:r/>
-            <w:r>
-              <w:rPr>
-                <w:rFonts w:ascii="Calibri" w:hAnsi="Calibri" w:eastAsia="Calibri"/>
-                <w:b w:val="0"/>
-                <w:color w:val="1A1A1A"/>
-                <w:sz w:val="16"/>
-              </w:rPr>
-              <w:t>Schemas; data dictionaries; backup sets; change scripts; access grants</w:t>
-            </w:r>
-          </w:p>
-        </w:tc>
-        <w:tc>
-          <w:tcPr>
-            <w:tcW w:type="dxa" w:w="2381"/>
-            <w:vAlign w:val="center"/>
-            <w:tcMar>
-              <w:top w:w="40" w:type="dxa"/>
-              <w:left w:w="60" w:type="dxa"/>
-              <w:bottom w:w="40" w:type="dxa"/>
-              <w:right w:w="60" w:type="dxa"/>
-            </w:tcMar>
-            <w:tcBorders>
-              <w:top w:val="single" w:sz="4" w:space="0" w:color="8AA0B4"/>
-              <w:left w:val="single" w:sz="4" w:space="0" w:color="8AA0B4"/>
-              <w:bottom w:val="single" w:sz="4" w:space="0" w:color="8AA0B4"/>
-              <w:right w:val="single" w:sz="4" w:space="0" w:color="8AA0B4"/>
-            </w:tcBorders>
-            <w:shd w:fill="FFFFFF" w:val="clear"/>
+            <w:shd w:fill="F4D03F" w:val="clear"/>
           </w:tcPr>
           <w:p>
             <w:pPr>
@@ -3094,42 +2787,7 @@
                 <w:color w:val="1A1A1A"/>
                 <w:sz w:val="16"/>
               </w:rPr>
-              <w:t>Database Administrator (Primary) / Senior Developer (Backup)</w:t>
-            </w:r>
-          </w:p>
-        </w:tc>
-        <w:tc>
-          <w:tcPr>
-            <w:tcW w:type="dxa" w:w="2381"/>
-            <w:vAlign w:val="center"/>
-            <w:tcMar>
-              <w:top w:w="40" w:type="dxa"/>
-              <w:left w:w="60" w:type="dxa"/>
-              <w:bottom w:w="40" w:type="dxa"/>
-              <w:right w:w="60" w:type="dxa"/>
-            </w:tcMar>
-            <w:tcBorders>
-              <w:top w:val="single" w:sz="4" w:space="0" w:color="8AA0B4"/>
-              <w:left w:val="single" w:sz="4" w:space="0" w:color="8AA0B4"/>
-              <w:bottom w:val="single" w:sz="4" w:space="0" w:color="8AA0B4"/>
-              <w:right w:val="single" w:sz="4" w:space="0" w:color="8AA0B4"/>
-            </w:tcBorders>
-            <w:shd w:fill="FFFFFF" w:val="clear"/>
-          </w:tcPr>
-          <w:p>
-            <w:pPr>
-              <w:spacing w:before="0" w:after="0" w:line="252" w:lineRule="auto"/>
-              <w:jc w:val="left"/>
-            </w:pPr>
-            <w:r/>
-            <w:r>
-              <w:rPr>
-                <w:rFonts w:ascii="Calibri" w:hAnsi="Calibri" w:eastAsia="Calibri"/>
-                <w:b w:val="0"/>
-                <w:color w:val="1A1A1A"/>
-                <w:sz w:val="16"/>
-              </w:rPr>
-              <w:t>Database platform vendor; Oracle Corporation (where the estate is Oracle)</w:t>
+              <w:t>Partial — Senior Developer designated for scripted changes, not full DBA cover</w:t>
             </w:r>
           </w:p>
         </w:tc>
@@ -3210,7 +2868,7 @@
         </w:tc>
         <w:tc>
           <w:tcPr>
-            <w:tcW w:type="dxa" w:w="2948"/>
+            <w:tcW w:type="dxa" w:w="3175"/>
             <w:vAlign w:val="center"/>
             <w:tcMar>
               <w:top w:w="40" w:type="dxa"/>
@@ -3239,13 +2897,13 @@
                 <w:color w:val="1A1A1A"/>
                 <w:sz w:val="16"/>
               </w:rPr>
-              <w:t>Licence inventory; vendor security advisories; source control (to apply upgrades)</w:t>
+              <w:t>Technical Lead as the only person tracking licences and patches; a single artefact registry</w:t>
             </w:r>
           </w:p>
         </w:tc>
         <w:tc>
           <w:tcPr>
-            <w:tcW w:type="dxa" w:w="2835"/>
+            <w:tcW w:type="dxa" w:w="3175"/>
             <w:vAlign w:val="center"/>
             <w:tcMar>
               <w:top w:w="40" w:type="dxa"/>
@@ -3274,13 +2932,13 @@
                 <w:color w:val="1A1A1A"/>
                 <w:sz w:val="16"/>
               </w:rPr>
-              <w:t>Build Management; application security; Release Deployment</w:t>
+              <w:t>Dependency/licence inventory; vendor security advisories</w:t>
             </w:r>
           </w:p>
         </w:tc>
         <w:tc>
           <w:tcPr>
-            <w:tcW w:type="dxa" w:w="2494"/>
+            <w:tcW w:type="dxa" w:w="3515"/>
             <w:vAlign w:val="center"/>
             <w:tcMar>
               <w:top w:w="40" w:type="dxa"/>
@@ -3309,7 +2967,42 @@
                 <w:color w:val="1A1A1A"/>
                 <w:sz w:val="16"/>
               </w:rPr>
-              <w:t>Dependency/licence inventory; source control; artefact repository</w:t>
+              <w:t>DevOps Engineer applies vendor patches from the inventory and lockfiles; rebuild artefacts from the last known-good set</w:t>
+            </w:r>
+          </w:p>
+        </w:tc>
+        <w:tc>
+          <w:tcPr>
+            <w:tcW w:type="dxa" w:w="2268"/>
+            <w:vAlign w:val="center"/>
+            <w:tcMar>
+              <w:top w:w="40" w:type="dxa"/>
+              <w:left w:w="60" w:type="dxa"/>
+              <w:bottom w:w="40" w:type="dxa"/>
+              <w:right w:w="60" w:type="dxa"/>
+            </w:tcMar>
+            <w:tcBorders>
+              <w:top w:val="single" w:sz="4" w:space="0" w:color="8AA0B4"/>
+              <w:left w:val="single" w:sz="4" w:space="0" w:color="8AA0B4"/>
+              <w:bottom w:val="single" w:sz="4" w:space="0" w:color="8AA0B4"/>
+              <w:right w:val="single" w:sz="4" w:space="0" w:color="8AA0B4"/>
+            </w:tcBorders>
+            <w:shd w:fill="82C785" w:val="clear"/>
+          </w:tcPr>
+          <w:p>
+            <w:pPr>
+              <w:spacing w:before="0" w:after="0" w:line="252" w:lineRule="auto"/>
+              <w:jc w:val="center"/>
+            </w:pPr>
+            <w:r/>
+            <w:r>
+              <w:rPr>
+                <w:rFonts w:ascii="Calibri" w:hAnsi="Calibri" w:eastAsia="Calibri"/>
+                <w:b/>
+                <w:color w:val="1A1A1A"/>
+                <w:sz w:val="16"/>
+              </w:rPr>
+              <w:t>Yes — VPN / remote</w:t>
             </w:r>
           </w:p>
         </w:tc>
@@ -3329,42 +3022,7 @@
               <w:bottom w:val="single" w:sz="4" w:space="0" w:color="8AA0B4"/>
               <w:right w:val="single" w:sz="4" w:space="0" w:color="8AA0B4"/>
             </w:tcBorders>
-            <w:shd w:fill="F4F7FA" w:val="clear"/>
-          </w:tcPr>
-          <w:p>
-            <w:pPr>
-              <w:spacing w:before="0" w:after="0" w:line="252" w:lineRule="auto"/>
-              <w:jc w:val="left"/>
-            </w:pPr>
-            <w:r/>
-            <w:r>
-              <w:rPr>
-                <w:rFonts w:ascii="Calibri" w:hAnsi="Calibri" w:eastAsia="Calibri"/>
-                <w:b w:val="0"/>
-                <w:color w:val="1A1A1A"/>
-                <w:sz w:val="16"/>
-              </w:rPr>
-              <w:t>Dependency inventory; licence records; vulnerability and patch status</w:t>
-            </w:r>
-          </w:p>
-        </w:tc>
-        <w:tc>
-          <w:tcPr>
-            <w:tcW w:type="dxa" w:w="2381"/>
-            <w:vAlign w:val="center"/>
-            <w:tcMar>
-              <w:top w:w="40" w:type="dxa"/>
-              <w:left w:w="60" w:type="dxa"/>
-              <w:bottom w:w="40" w:type="dxa"/>
-              <w:right w:w="60" w:type="dxa"/>
-            </w:tcMar>
-            <w:tcBorders>
-              <w:top w:val="single" w:sz="4" w:space="0" w:color="8AA0B4"/>
-              <w:left w:val="single" w:sz="4" w:space="0" w:color="8AA0B4"/>
-              <w:bottom w:val="single" w:sz="4" w:space="0" w:color="8AA0B4"/>
-              <w:right w:val="single" w:sz="4" w:space="0" w:color="8AA0B4"/>
-            </w:tcBorders>
-            <w:shd w:fill="F4F7FA" w:val="clear"/>
+            <w:shd w:fill="F4D03F" w:val="clear"/>
           </w:tcPr>
           <w:p>
             <w:pPr>
@@ -3379,42 +3037,7 @@
                 <w:color w:val="1A1A1A"/>
                 <w:sz w:val="16"/>
               </w:rPr>
-              <w:t>Technical Lead (Primary) / DevOps Engineer (Backup)</w:t>
-            </w:r>
-          </w:p>
-        </w:tc>
-        <w:tc>
-          <w:tcPr>
-            <w:tcW w:type="dxa" w:w="2381"/>
-            <w:vAlign w:val="center"/>
-            <w:tcMar>
-              <w:top w:w="40" w:type="dxa"/>
-              <w:left w:w="60" w:type="dxa"/>
-              <w:bottom w:w="40" w:type="dxa"/>
-              <w:right w:w="60" w:type="dxa"/>
-            </w:tcMar>
-            <w:tcBorders>
-              <w:top w:val="single" w:sz="4" w:space="0" w:color="8AA0B4"/>
-              <w:left w:val="single" w:sz="4" w:space="0" w:color="8AA0B4"/>
-              <w:bottom w:val="single" w:sz="4" w:space="0" w:color="8AA0B4"/>
-              <w:right w:val="single" w:sz="4" w:space="0" w:color="8AA0B4"/>
-            </w:tcBorders>
-            <w:shd w:fill="F4F7FA" w:val="clear"/>
-          </w:tcPr>
-          <w:p>
-            <w:pPr>
-              <w:spacing w:before="0" w:after="0" w:line="252" w:lineRule="auto"/>
-              <w:jc w:val="left"/>
-            </w:pPr>
-            <w:r/>
-            <w:r>
-              <w:rPr>
-                <w:rFonts w:ascii="Calibri" w:hAnsi="Calibri" w:eastAsia="Calibri"/>
-                <w:b w:val="0"/>
-                <w:color w:val="1A1A1A"/>
-                <w:sz w:val="16"/>
-              </w:rPr>
-              <w:t>Component and library vendors; Oracle Corporation and other platform vendors</w:t>
+              <w:t>Partial — DevOps Engineer designated as backup</w:t>
             </w:r>
           </w:p>
         </w:tc>
@@ -3495,7 +3118,7 @@
         </w:tc>
         <w:tc>
           <w:tcPr>
-            <w:tcW w:type="dxa" w:w="2948"/>
+            <w:tcW w:type="dxa" w:w="3175"/>
             <w:vAlign w:val="center"/>
             <w:tcMar>
               <w:top w:w="40" w:type="dxa"/>
@@ -3524,13 +3147,13 @@
                 <w:color w:val="1A1A1A"/>
                 <w:sz w:val="16"/>
               </w:rPr>
-              <w:t>HR/Admin joiner–mover–leaver notice; identity directory; approved access request in the ticketing portal</w:t>
+              <w:t>Security Administrator; identity directory; a single break-glass path</w:t>
             </w:r>
           </w:p>
         </w:tc>
         <w:tc>
           <w:tcPr>
-            <w:tcW w:type="dxa" w:w="2835"/>
+            <w:tcW w:type="dxa" w:w="3175"/>
             <w:vAlign w:val="center"/>
             <w:tcMar>
               <w:top w:w="40" w:type="dxa"/>
@@ -3559,13 +3182,13 @@
                 <w:color w:val="1A1A1A"/>
                 <w:sz w:val="16"/>
               </w:rPr>
-              <w:t>All technical activities that touch production; client data protection; audit</w:t>
+              <w:t>Access requests via ticketing portal; HR joiner–mover–leaver notices; periodic access review</w:t>
             </w:r>
           </w:p>
         </w:tc>
         <w:tc>
           <w:tcPr>
-            <w:tcW w:type="dxa" w:w="2494"/>
+            <w:tcW w:type="dxa" w:w="3515"/>
             <w:vAlign w:val="center"/>
             <w:tcMar>
               <w:top w:w="40" w:type="dxa"/>
@@ -3594,7 +3217,42 @@
                 <w:color w:val="1A1A1A"/>
                 <w:sz w:val="16"/>
               </w:rPr>
-              <w:t>Identity directory; VPN; privileged-access consoles; ticketing portal</w:t>
+              <w:t>Technical Lead uses the documented break-glass admin; restore the directory from backup; HR-driven leaver disable</w:t>
+            </w:r>
+          </w:p>
+        </w:tc>
+        <w:tc>
+          <w:tcPr>
+            <w:tcW w:type="dxa" w:w="2268"/>
+            <w:vAlign w:val="center"/>
+            <w:tcMar>
+              <w:top w:w="40" w:type="dxa"/>
+              <w:left w:w="60" w:type="dxa"/>
+              <w:bottom w:w="40" w:type="dxa"/>
+              <w:right w:w="60" w:type="dxa"/>
+            </w:tcMar>
+            <w:tcBorders>
+              <w:top w:val="single" w:sz="4" w:space="0" w:color="8AA0B4"/>
+              <w:left w:val="single" w:sz="4" w:space="0" w:color="8AA0B4"/>
+              <w:bottom w:val="single" w:sz="4" w:space="0" w:color="8AA0B4"/>
+              <w:right w:val="single" w:sz="4" w:space="0" w:color="8AA0B4"/>
+            </w:tcBorders>
+            <w:shd w:fill="82C785" w:val="clear"/>
+          </w:tcPr>
+          <w:p>
+            <w:pPr>
+              <w:spacing w:before="0" w:after="0" w:line="252" w:lineRule="auto"/>
+              <w:jc w:val="center"/>
+            </w:pPr>
+            <w:r/>
+            <w:r>
+              <w:rPr>
+                <w:rFonts w:ascii="Calibri" w:hAnsi="Calibri" w:eastAsia="Calibri"/>
+                <w:b/>
+                <w:color w:val="1A1A1A"/>
+                <w:sz w:val="16"/>
+              </w:rPr>
+              <w:t>Yes — VPN / admin console</w:t>
             </w:r>
           </w:p>
         </w:tc>
@@ -3614,42 +3272,7 @@
               <w:bottom w:val="single" w:sz="4" w:space="0" w:color="8AA0B4"/>
               <w:right w:val="single" w:sz="4" w:space="0" w:color="8AA0B4"/>
             </w:tcBorders>
-            <w:shd w:fill="FFFFFF" w:val="clear"/>
-          </w:tcPr>
-          <w:p>
-            <w:pPr>
-              <w:spacing w:before="0" w:after="0" w:line="252" w:lineRule="auto"/>
-              <w:jc w:val="left"/>
-            </w:pPr>
-            <w:r/>
-            <w:r>
-              <w:rPr>
-                <w:rFonts w:ascii="Calibri" w:hAnsi="Calibri" w:eastAsia="Calibri"/>
-                <w:b w:val="0"/>
-                <w:color w:val="1A1A1A"/>
-                <w:sz w:val="16"/>
-              </w:rPr>
-              <w:t>Access matrices; secrets inventory; vulnerability results; access-review evidence</w:t>
-            </w:r>
-          </w:p>
-        </w:tc>
-        <w:tc>
-          <w:tcPr>
-            <w:tcW w:type="dxa" w:w="2381"/>
-            <w:vAlign w:val="center"/>
-            <w:tcMar>
-              <w:top w:w="40" w:type="dxa"/>
-              <w:left w:w="60" w:type="dxa"/>
-              <w:bottom w:w="40" w:type="dxa"/>
-              <w:right w:w="60" w:type="dxa"/>
-            </w:tcMar>
-            <w:tcBorders>
-              <w:top w:val="single" w:sz="4" w:space="0" w:color="8AA0B4"/>
-              <w:left w:val="single" w:sz="4" w:space="0" w:color="8AA0B4"/>
-              <w:bottom w:val="single" w:sz="4" w:space="0" w:color="8AA0B4"/>
-              <w:right w:val="single" w:sz="4" w:space="0" w:color="8AA0B4"/>
-            </w:tcBorders>
-            <w:shd w:fill="FFFFFF" w:val="clear"/>
+            <w:shd w:fill="F4D03F" w:val="clear"/>
           </w:tcPr>
           <w:p>
             <w:pPr>
@@ -3664,42 +3287,7 @@
                 <w:color w:val="1A1A1A"/>
                 <w:sz w:val="16"/>
               </w:rPr>
-              <w:t>Security Administrator (Primary) / Technical Lead (Backup)</w:t>
-            </w:r>
-          </w:p>
-        </w:tc>
-        <w:tc>
-          <w:tcPr>
-            <w:tcW w:type="dxa" w:w="2381"/>
-            <w:vAlign w:val="center"/>
-            <w:tcMar>
-              <w:top w:w="40" w:type="dxa"/>
-              <w:left w:w="60" w:type="dxa"/>
-              <w:bottom w:w="40" w:type="dxa"/>
-              <w:right w:w="60" w:type="dxa"/>
-            </w:tcMar>
-            <w:tcBorders>
-              <w:top w:val="single" w:sz="4" w:space="0" w:color="8AA0B4"/>
-              <w:left w:val="single" w:sz="4" w:space="0" w:color="8AA0B4"/>
-              <w:bottom w:val="single" w:sz="4" w:space="0" w:color="8AA0B4"/>
-              <w:right w:val="single" w:sz="4" w:space="0" w:color="8AA0B4"/>
-            </w:tcBorders>
-            <w:shd w:fill="FFFFFF" w:val="clear"/>
-          </w:tcPr>
-          <w:p>
-            <w:pPr>
-              <w:spacing w:before="0" w:after="0" w:line="252" w:lineRule="auto"/>
-              <w:jc w:val="left"/>
-            </w:pPr>
-            <w:r/>
-            <w:r>
-              <w:rPr>
-                <w:rFonts w:ascii="Calibri" w:hAnsi="Calibri" w:eastAsia="Calibri"/>
-                <w:b w:val="0"/>
-                <w:color w:val="1A1A1A"/>
-                <w:sz w:val="16"/>
-              </w:rPr>
-              <w:t>Identity and VPN vendor; security-tooling vendor</w:t>
+              <w:t>Partial — Technical Lead designated as backup</w:t>
             </w:r>
           </w:p>
         </w:tc>
@@ -3780,7 +3368,7 @@
         </w:tc>
         <w:tc>
           <w:tcPr>
-            <w:tcW w:type="dxa" w:w="2948"/>
+            <w:tcW w:type="dxa" w:w="3175"/>
             <w:vAlign w:val="center"/>
             <w:tcMar>
               <w:top w:w="40" w:type="dxa"/>
@@ -3809,13 +3397,13 @@
                 <w:color w:val="1A1A1A"/>
                 <w:sz w:val="16"/>
               </w:rPr>
-              <w:t>Cloud/infrastructure capacity; network and VPN; configuration baselines</w:t>
+              <w:t>DevOps Engineer; cloud account owner; environment config not stored in source control</w:t>
             </w:r>
           </w:p>
         </w:tc>
         <w:tc>
           <w:tcPr>
-            <w:tcW w:type="dxa" w:w="2835"/>
+            <w:tcW w:type="dxa" w:w="3175"/>
             <w:vAlign w:val="center"/>
             <w:tcMar>
               <w:top w:w="40" w:type="dxa"/>
@@ -3844,13 +3432,13 @@
                 <w:color w:val="1A1A1A"/>
                 <w:sz w:val="16"/>
               </w:rPr>
-              <w:t>Application Development; Testing &amp; QA; Release Deployment</w:t>
+              <w:t>Configuration baselines; data-masking rules for non-production</w:t>
             </w:r>
           </w:p>
         </w:tc>
         <w:tc>
           <w:tcPr>
-            <w:tcW w:type="dxa" w:w="2494"/>
+            <w:tcW w:type="dxa" w:w="3515"/>
             <w:vAlign w:val="center"/>
             <w:tcMar>
               <w:top w:w="40" w:type="dxa"/>
@@ -3879,7 +3467,42 @@
                 <w:color w:val="1A1A1A"/>
                 <w:sz w:val="16"/>
               </w:rPr>
-              <w:t>Environment/cloud console; configuration management; VPN</w:t>
+              <w:t>Rebuild the environment from the documented baseline (or infrastructure-as-code if present); Technical Lead</w:t>
+            </w:r>
+          </w:p>
+        </w:tc>
+        <w:tc>
+          <w:tcPr>
+            <w:tcW w:type="dxa" w:w="2268"/>
+            <w:vAlign w:val="center"/>
+            <w:tcMar>
+              <w:top w:w="40" w:type="dxa"/>
+              <w:left w:w="60" w:type="dxa"/>
+              <w:bottom w:w="40" w:type="dxa"/>
+              <w:right w:w="60" w:type="dxa"/>
+            </w:tcMar>
+            <w:tcBorders>
+              <w:top w:val="single" w:sz="4" w:space="0" w:color="8AA0B4"/>
+              <w:left w:val="single" w:sz="4" w:space="0" w:color="8AA0B4"/>
+              <w:bottom w:val="single" w:sz="4" w:space="0" w:color="8AA0B4"/>
+              <w:right w:val="single" w:sz="4" w:space="0" w:color="8AA0B4"/>
+            </w:tcBorders>
+            <w:shd w:fill="82C785" w:val="clear"/>
+          </w:tcPr>
+          <w:p>
+            <w:pPr>
+              <w:spacing w:before="0" w:after="0" w:line="252" w:lineRule="auto"/>
+              <w:jc w:val="center"/>
+            </w:pPr>
+            <w:r/>
+            <w:r>
+              <w:rPr>
+                <w:rFonts w:ascii="Calibri" w:hAnsi="Calibri" w:eastAsia="Calibri"/>
+                <w:b/>
+                <w:color w:val="1A1A1A"/>
+                <w:sz w:val="16"/>
+              </w:rPr>
+              <w:t>Yes — cloud console via VPN from any site</w:t>
             </w:r>
           </w:p>
         </w:tc>
@@ -3899,42 +3522,7 @@
               <w:bottom w:val="single" w:sz="4" w:space="0" w:color="8AA0B4"/>
               <w:right w:val="single" w:sz="4" w:space="0" w:color="8AA0B4"/>
             </w:tcBorders>
-            <w:shd w:fill="F4F7FA" w:val="clear"/>
-          </w:tcPr>
-          <w:p>
-            <w:pPr>
-              <w:spacing w:before="0" w:after="0" w:line="252" w:lineRule="auto"/>
-              <w:jc w:val="left"/>
-            </w:pPr>
-            <w:r/>
-            <w:r>
-              <w:rPr>
-                <w:rFonts w:ascii="Calibri" w:hAnsi="Calibri" w:eastAsia="Calibri"/>
-                <w:b w:val="0"/>
-                <w:color w:val="1A1A1A"/>
-                <w:sz w:val="16"/>
-              </w:rPr>
-              <w:t>Environment inventory; configuration baselines; credentials; data-masking rules</w:t>
-            </w:r>
-          </w:p>
-        </w:tc>
-        <w:tc>
-          <w:tcPr>
-            <w:tcW w:type="dxa" w:w="2381"/>
-            <w:vAlign w:val="center"/>
-            <w:tcMar>
-              <w:top w:w="40" w:type="dxa"/>
-              <w:left w:w="60" w:type="dxa"/>
-              <w:bottom w:w="40" w:type="dxa"/>
-              <w:right w:w="60" w:type="dxa"/>
-            </w:tcMar>
-            <w:tcBorders>
-              <w:top w:val="single" w:sz="4" w:space="0" w:color="8AA0B4"/>
-              <w:left w:val="single" w:sz="4" w:space="0" w:color="8AA0B4"/>
-              <w:bottom w:val="single" w:sz="4" w:space="0" w:color="8AA0B4"/>
-              <w:right w:val="single" w:sz="4" w:space="0" w:color="8AA0B4"/>
-            </w:tcBorders>
-            <w:shd w:fill="F4F7FA" w:val="clear"/>
+            <w:shd w:fill="F4D03F" w:val="clear"/>
           </w:tcPr>
           <w:p>
             <w:pPr>
@@ -3949,42 +3537,7 @@
                 <w:color w:val="1A1A1A"/>
                 <w:sz w:val="16"/>
               </w:rPr>
-              <w:t>DevOps Engineer (Primary) / Technical Lead (Backup)</w:t>
-            </w:r>
-          </w:p>
-        </w:tc>
-        <w:tc>
-          <w:tcPr>
-            <w:tcW w:type="dxa" w:w="2381"/>
-            <w:vAlign w:val="center"/>
-            <w:tcMar>
-              <w:top w:w="40" w:type="dxa"/>
-              <w:left w:w="60" w:type="dxa"/>
-              <w:bottom w:w="40" w:type="dxa"/>
-              <w:right w:w="60" w:type="dxa"/>
-            </w:tcMar>
-            <w:tcBorders>
-              <w:top w:val="single" w:sz="4" w:space="0" w:color="8AA0B4"/>
-              <w:left w:val="single" w:sz="4" w:space="0" w:color="8AA0B4"/>
-              <w:bottom w:val="single" w:sz="4" w:space="0" w:color="8AA0B4"/>
-              <w:right w:val="single" w:sz="4" w:space="0" w:color="8AA0B4"/>
-            </w:tcBorders>
-            <w:shd w:fill="F4F7FA" w:val="clear"/>
-          </w:tcPr>
-          <w:p>
-            <w:pPr>
-              <w:spacing w:before="0" w:after="0" w:line="252" w:lineRule="auto"/>
-              <w:jc w:val="left"/>
-            </w:pPr>
-            <w:r/>
-            <w:r>
-              <w:rPr>
-                <w:rFonts w:ascii="Calibri" w:hAnsi="Calibri" w:eastAsia="Calibri"/>
-                <w:b w:val="0"/>
-                <w:color w:val="1A1A1A"/>
-                <w:sz w:val="16"/>
-              </w:rPr>
-              <w:t>Cloud/hosting provider</w:t>
+              <w:t>Partial — Technical Lead designated as backup</w:t>
             </w:r>
           </w:p>
         </w:tc>
@@ -4065,7 +3618,7 @@
         </w:tc>
         <w:tc>
           <w:tcPr>
-            <w:tcW w:type="dxa" w:w="2948"/>
+            <w:tcW w:type="dxa" w:w="3175"/>
             <w:vAlign w:val="center"/>
             <w:tcMar>
               <w:top w:w="40" w:type="dxa"/>
@@ -4094,13 +3647,13 @@
                 <w:color w:val="1A1A1A"/>
                 <w:sz w:val="16"/>
               </w:rPr>
-              <w:t>Source system availability (client Oracle ERP / operational databases); mapping specs; month-end/quarter-end window</w:t>
+              <w:t>Data Engineer; ETL platform; source Oracle ERP / operational database availability</w:t>
             </w:r>
           </w:p>
         </w:tc>
         <w:tc>
           <w:tcPr>
-            <w:tcW w:type="dxa" w:w="2835"/>
+            <w:tcW w:type="dxa" w:w="3175"/>
             <w:vAlign w:val="center"/>
             <w:tcMar>
               <w:top w:w="40" w:type="dxa"/>
@@ -4129,13 +3682,13 @@
                 <w:color w:val="1A1A1A"/>
                 <w:sz w:val="16"/>
               </w:rPr>
-              <w:t>Client reports and dashboards; Implementation Functional Unit; client finance close</w:t>
+              <w:t>Mapping specifications; load logs; data-quality exception records; VPN</w:t>
             </w:r>
           </w:p>
         </w:tc>
         <w:tc>
           <w:tcPr>
-            <w:tcW w:type="dxa" w:w="2494"/>
+            <w:tcW w:type="dxa" w:w="3515"/>
             <w:vAlign w:val="center"/>
             <w:tcMar>
               <w:top w:w="40" w:type="dxa"/>
@@ -4164,7 +3717,42 @@
                 <w:color w:val="1A1A1A"/>
                 <w:sz w:val="16"/>
               </w:rPr>
-              <w:t>ETL/integration platform; source and target databases; VPN</w:t>
+              <w:t>Database Administrator re-runs documented jobs; restore mappings from the repository; delay non-close jobs</w:t>
+            </w:r>
+          </w:p>
+        </w:tc>
+        <w:tc>
+          <w:tcPr>
+            <w:tcW w:type="dxa" w:w="2268"/>
+            <w:vAlign w:val="center"/>
+            <w:tcMar>
+              <w:top w:w="40" w:type="dxa"/>
+              <w:left w:w="60" w:type="dxa"/>
+              <w:bottom w:w="40" w:type="dxa"/>
+              <w:right w:w="60" w:type="dxa"/>
+            </w:tcMar>
+            <w:tcBorders>
+              <w:top w:val="single" w:sz="4" w:space="0" w:color="8AA0B4"/>
+              <w:left w:val="single" w:sz="4" w:space="0" w:color="8AA0B4"/>
+              <w:bottom w:val="single" w:sz="4" w:space="0" w:color="8AA0B4"/>
+              <w:right w:val="single" w:sz="4" w:space="0" w:color="8AA0B4"/>
+            </w:tcBorders>
+            <w:shd w:fill="82C785" w:val="clear"/>
+          </w:tcPr>
+          <w:p>
+            <w:pPr>
+              <w:spacing w:before="0" w:after="0" w:line="252" w:lineRule="auto"/>
+              <w:jc w:val="center"/>
+            </w:pPr>
+            <w:r/>
+            <w:r>
+              <w:rPr>
+                <w:rFonts w:ascii="Calibri" w:hAnsi="Calibri" w:eastAsia="Calibri"/>
+                <w:b/>
+                <w:color w:val="1A1A1A"/>
+                <w:sz w:val="16"/>
+              </w:rPr>
+              <w:t>Yes — VPN to source and target systems</w:t>
             </w:r>
           </w:p>
         </w:tc>
@@ -4184,42 +3772,7 @@
               <w:bottom w:val="single" w:sz="4" w:space="0" w:color="8AA0B4"/>
               <w:right w:val="single" w:sz="4" w:space="0" w:color="8AA0B4"/>
             </w:tcBorders>
-            <w:shd w:fill="FFFFFF" w:val="clear"/>
-          </w:tcPr>
-          <w:p>
-            <w:pPr>
-              <w:spacing w:before="0" w:after="0" w:line="252" w:lineRule="auto"/>
-              <w:jc w:val="left"/>
-            </w:pPr>
-            <w:r/>
-            <w:r>
-              <w:rPr>
-                <w:rFonts w:ascii="Calibri" w:hAnsi="Calibri" w:eastAsia="Calibri"/>
-                <w:b w:val="0"/>
-                <w:color w:val="1A1A1A"/>
-                <w:sz w:val="16"/>
-              </w:rPr>
-              <w:t>Source extracts; transformation mappings; load logs; data-quality exceptions</w:t>
-            </w:r>
-          </w:p>
-        </w:tc>
-        <w:tc>
-          <w:tcPr>
-            <w:tcW w:type="dxa" w:w="2381"/>
-            <w:vAlign w:val="center"/>
-            <w:tcMar>
-              <w:top w:w="40" w:type="dxa"/>
-              <w:left w:w="60" w:type="dxa"/>
-              <w:bottom w:w="40" w:type="dxa"/>
-              <w:right w:w="60" w:type="dxa"/>
-            </w:tcMar>
-            <w:tcBorders>
-              <w:top w:val="single" w:sz="4" w:space="0" w:color="8AA0B4"/>
-              <w:left w:val="single" w:sz="4" w:space="0" w:color="8AA0B4"/>
-              <w:bottom w:val="single" w:sz="4" w:space="0" w:color="8AA0B4"/>
-              <w:right w:val="single" w:sz="4" w:space="0" w:color="8AA0B4"/>
-            </w:tcBorders>
-            <w:shd w:fill="FFFFFF" w:val="clear"/>
+            <w:shd w:fill="F4D03F" w:val="clear"/>
           </w:tcPr>
           <w:p>
             <w:pPr>
@@ -4234,42 +3787,7 @@
                 <w:color w:val="1A1A1A"/>
                 <w:sz w:val="16"/>
               </w:rPr>
-              <w:t>Data Engineer (Primary) / Database Administrator (Backup)</w:t>
-            </w:r>
-          </w:p>
-        </w:tc>
-        <w:tc>
-          <w:tcPr>
-            <w:tcW w:type="dxa" w:w="2381"/>
-            <w:vAlign w:val="center"/>
-            <w:tcMar>
-              <w:top w:w="40" w:type="dxa"/>
-              <w:left w:w="60" w:type="dxa"/>
-              <w:bottom w:w="40" w:type="dxa"/>
-              <w:right w:w="60" w:type="dxa"/>
-            </w:tcMar>
-            <w:tcBorders>
-              <w:top w:val="single" w:sz="4" w:space="0" w:color="8AA0B4"/>
-              <w:left w:val="single" w:sz="4" w:space="0" w:color="8AA0B4"/>
-              <w:bottom w:val="single" w:sz="4" w:space="0" w:color="8AA0B4"/>
-              <w:right w:val="single" w:sz="4" w:space="0" w:color="8AA0B4"/>
-            </w:tcBorders>
-            <w:shd w:fill="FFFFFF" w:val="clear"/>
-          </w:tcPr>
-          <w:p>
-            <w:pPr>
-              <w:spacing w:before="0" w:after="0" w:line="252" w:lineRule="auto"/>
-              <w:jc w:val="left"/>
-            </w:pPr>
-            <w:r/>
-            <w:r>
-              <w:rPr>
-                <w:rFonts w:ascii="Calibri" w:hAnsi="Calibri" w:eastAsia="Calibri"/>
-                <w:b w:val="0"/>
-                <w:color w:val="1A1A1A"/>
-                <w:sz w:val="16"/>
-              </w:rPr>
-              <w:t>Integration/ETL vendor; Oracle Corporation (source ERP)</w:t>
+              <w:t>Partial — Database Administrator designated for documented jobs</w:t>
             </w:r>
           </w:p>
         </w:tc>
@@ -4350,7 +3868,7 @@
         </w:tc>
         <w:tc>
           <w:tcPr>
-            <w:tcW w:type="dxa" w:w="2948"/>
+            <w:tcW w:type="dxa" w:w="3175"/>
             <w:vAlign w:val="center"/>
             <w:tcMar>
               <w:top w:w="40" w:type="dxa"/>
@@ -4379,13 +3897,13 @@
                 <w:color w:val="1A1A1A"/>
                 <w:sz w:val="16"/>
               </w:rPr>
-              <w:t>Ticketing portal; VPN to client/production; logging and monitoring; runbooks; client SLA terms</w:t>
+              <w:t>Support Lead; ticketing portal; VPN to client production; Oracle vendor support hours</w:t>
             </w:r>
           </w:p>
         </w:tc>
         <w:tc>
           <w:tcPr>
-            <w:tcW w:type="dxa" w:w="2835"/>
+            <w:tcW w:type="dxa" w:w="3175"/>
             <w:vAlign w:val="center"/>
             <w:tcMar>
               <w:top w:w="40" w:type="dxa"/>
@@ -4414,13 +3932,13 @@
                 <w:color w:val="1A1A1A"/>
                 <w:sz w:val="16"/>
               </w:rPr>
-              <w:t>Business Development; client operations; Incident Management</w:t>
+              <w:t>Ticket history; SLA terms; runbooks; monitoring; escalation contacts</w:t>
             </w:r>
           </w:p>
         </w:tc>
         <w:tc>
           <w:tcPr>
-            <w:tcW w:type="dxa" w:w="2494"/>
+            <w:tcW w:type="dxa" w:w="3515"/>
             <w:vAlign w:val="center"/>
             <w:tcMar>
               <w:top w:w="40" w:type="dxa"/>
@@ -4449,7 +3967,42 @@
                 <w:color w:val="1A1A1A"/>
                 <w:sz w:val="16"/>
               </w:rPr>
-              <w:t>Ticketing portal; VPN; production systems (Oracle ERP where applicable); monitoring</w:t>
+              <w:t>Senior Developer follows runbooks; escalate to Oracle/cloud vendor; use the on-call rota</w:t>
+            </w:r>
+          </w:p>
+        </w:tc>
+        <w:tc>
+          <w:tcPr>
+            <w:tcW w:type="dxa" w:w="2268"/>
+            <w:vAlign w:val="center"/>
+            <w:tcMar>
+              <w:top w:w="40" w:type="dxa"/>
+              <w:left w:w="60" w:type="dxa"/>
+              <w:bottom w:w="40" w:type="dxa"/>
+              <w:right w:w="60" w:type="dxa"/>
+            </w:tcMar>
+            <w:tcBorders>
+              <w:top w:val="single" w:sz="4" w:space="0" w:color="8AA0B4"/>
+              <w:left w:val="single" w:sz="4" w:space="0" w:color="8AA0B4"/>
+              <w:bottom w:val="single" w:sz="4" w:space="0" w:color="8AA0B4"/>
+              <w:right w:val="single" w:sz="4" w:space="0" w:color="8AA0B4"/>
+            </w:tcBorders>
+            <w:shd w:fill="82C785" w:val="clear"/>
+          </w:tcPr>
+          <w:p>
+            <w:pPr>
+              <w:spacing w:before="0" w:after="0" w:line="252" w:lineRule="auto"/>
+              <w:jc w:val="center"/>
+            </w:pPr>
+            <w:r/>
+            <w:r>
+              <w:rPr>
+                <w:rFonts w:ascii="Calibri" w:hAnsi="Calibri" w:eastAsia="Calibri"/>
+                <w:b/>
+                <w:color w:val="1A1A1A"/>
+                <w:sz w:val="16"/>
+              </w:rPr>
+              <w:t>Yes — VPN / remote (client support is remote-capable)</w:t>
             </w:r>
           </w:p>
         </w:tc>
@@ -4469,42 +4022,7 @@
               <w:bottom w:val="single" w:sz="4" w:space="0" w:color="8AA0B4"/>
               <w:right w:val="single" w:sz="4" w:space="0" w:color="8AA0B4"/>
             </w:tcBorders>
-            <w:shd w:fill="F4F7FA" w:val="clear"/>
-          </w:tcPr>
-          <w:p>
-            <w:pPr>
-              <w:spacing w:before="0" w:after="0" w:line="252" w:lineRule="auto"/>
-              <w:jc w:val="left"/>
-            </w:pPr>
-            <w:r/>
-            <w:r>
-              <w:rPr>
-                <w:rFonts w:ascii="Calibri" w:hAnsi="Calibri" w:eastAsia="Calibri"/>
-                <w:b w:val="0"/>
-                <w:color w:val="1A1A1A"/>
-                <w:sz w:val="16"/>
-              </w:rPr>
-              <w:t>Ticket history; SLA terms; escalation contacts; diagnostic logs; workaround records</w:t>
-            </w:r>
-          </w:p>
-        </w:tc>
-        <w:tc>
-          <w:tcPr>
-            <w:tcW w:type="dxa" w:w="2381"/>
-            <w:vAlign w:val="center"/>
-            <w:tcMar>
-              <w:top w:w="40" w:type="dxa"/>
-              <w:left w:w="60" w:type="dxa"/>
-              <w:bottom w:w="40" w:type="dxa"/>
-              <w:right w:w="60" w:type="dxa"/>
-            </w:tcMar>
-            <w:tcBorders>
-              <w:top w:val="single" w:sz="4" w:space="0" w:color="8AA0B4"/>
-              <w:left w:val="single" w:sz="4" w:space="0" w:color="8AA0B4"/>
-              <w:bottom w:val="single" w:sz="4" w:space="0" w:color="8AA0B4"/>
-              <w:right w:val="single" w:sz="4" w:space="0" w:color="8AA0B4"/>
-            </w:tcBorders>
-            <w:shd w:fill="F4F7FA" w:val="clear"/>
+            <w:shd w:fill="F4D03F" w:val="clear"/>
           </w:tcPr>
           <w:p>
             <w:pPr>
@@ -4519,42 +4037,7 @@
                 <w:color w:val="1A1A1A"/>
                 <w:sz w:val="16"/>
               </w:rPr>
-              <w:t>Support Lead (Primary) / Senior Developer (Backup)</w:t>
-            </w:r>
-          </w:p>
-        </w:tc>
-        <w:tc>
-          <w:tcPr>
-            <w:tcW w:type="dxa" w:w="2381"/>
-            <w:vAlign w:val="center"/>
-            <w:tcMar>
-              <w:top w:w="40" w:type="dxa"/>
-              <w:left w:w="60" w:type="dxa"/>
-              <w:bottom w:w="40" w:type="dxa"/>
-              <w:right w:w="60" w:type="dxa"/>
-            </w:tcMar>
-            <w:tcBorders>
-              <w:top w:val="single" w:sz="4" w:space="0" w:color="8AA0B4"/>
-              <w:left w:val="single" w:sz="4" w:space="0" w:color="8AA0B4"/>
-              <w:bottom w:val="single" w:sz="4" w:space="0" w:color="8AA0B4"/>
-              <w:right w:val="single" w:sz="4" w:space="0" w:color="8AA0B4"/>
-            </w:tcBorders>
-            <w:shd w:fill="F4F7FA" w:val="clear"/>
-          </w:tcPr>
-          <w:p>
-            <w:pPr>
-              <w:spacing w:before="0" w:after="0" w:line="252" w:lineRule="auto"/>
-              <w:jc w:val="left"/>
-            </w:pPr>
-            <w:r/>
-            <w:r>
-              <w:rPr>
-                <w:rFonts w:ascii="Calibri" w:hAnsi="Calibri" w:eastAsia="Calibri"/>
-                <w:b w:val="0"/>
-                <w:color w:val="1A1A1A"/>
-                <w:sz w:val="16"/>
-              </w:rPr>
-              <w:t>Oracle Corporation (vendor support); cloud/hosting provider</w:t>
+              <w:t>Partial — Senior Developer designated as backup</w:t>
             </w:r>
           </w:p>
         </w:tc>
@@ -4635,7 +4118,7 @@
         </w:tc>
         <w:tc>
           <w:tcPr>
-            <w:tcW w:type="dxa" w:w="2948"/>
+            <w:tcW w:type="dxa" w:w="3175"/>
             <w:vAlign w:val="center"/>
             <w:tcMar>
               <w:top w:w="40" w:type="dxa"/>
@@ -4664,13 +4147,13 @@
                 <w:color w:val="1A1A1A"/>
                 <w:sz w:val="16"/>
               </w:rPr>
-              <w:t>HR/Admin starter and leaver notifications; approved access request; identity directory</w:t>
+              <w:t>Access Administrator; identity directory; HR notice not reaching Technical</w:t>
             </w:r>
           </w:p>
         </w:tc>
         <w:tc>
           <w:tcPr>
-            <w:tcW w:type="dxa" w:w="2835"/>
+            <w:tcW w:type="dxa" w:w="3175"/>
             <w:vAlign w:val="center"/>
             <w:tcMar>
               <w:top w:w="40" w:type="dxa"/>
@@ -4699,13 +4182,13 @@
                 <w:color w:val="1A1A1A"/>
                 <w:sz w:val="16"/>
               </w:rPr>
-              <w:t>New staff productivity; security (stale access); all system owners</w:t>
+              <w:t>Ticketing for access requests; joiner–mover–leaver records; HR/Admin liaison</w:t>
             </w:r>
           </w:p>
         </w:tc>
         <w:tc>
           <w:tcPr>
-            <w:tcW w:type="dxa" w:w="2494"/>
+            <w:tcW w:type="dxa" w:w="3515"/>
             <w:vAlign w:val="center"/>
             <w:tcMar>
               <w:top w:w="40" w:type="dxa"/>
@@ -4734,7 +4217,42 @@
                 <w:color w:val="1A1A1A"/>
                 <w:sz w:val="16"/>
               </w:rPr>
-              <w:t>Identity directory; VPN account administration; ticketing portal</w:t>
+              <w:t>HR/Admin Liaison disables leavers from the documented checklist; restore the directory from backup</w:t>
+            </w:r>
+          </w:p>
+        </w:tc>
+        <w:tc>
+          <w:tcPr>
+            <w:tcW w:type="dxa" w:w="2268"/>
+            <w:vAlign w:val="center"/>
+            <w:tcMar>
+              <w:top w:w="40" w:type="dxa"/>
+              <w:left w:w="60" w:type="dxa"/>
+              <w:bottom w:w="40" w:type="dxa"/>
+              <w:right w:w="60" w:type="dxa"/>
+            </w:tcMar>
+            <w:tcBorders>
+              <w:top w:val="single" w:sz="4" w:space="0" w:color="8AA0B4"/>
+              <w:left w:val="single" w:sz="4" w:space="0" w:color="8AA0B4"/>
+              <w:bottom w:val="single" w:sz="4" w:space="0" w:color="8AA0B4"/>
+              <w:right w:val="single" w:sz="4" w:space="0" w:color="8AA0B4"/>
+            </w:tcBorders>
+            <w:shd w:fill="82C785" w:val="clear"/>
+          </w:tcPr>
+          <w:p>
+            <w:pPr>
+              <w:spacing w:before="0" w:after="0" w:line="252" w:lineRule="auto"/>
+              <w:jc w:val="center"/>
+            </w:pPr>
+            <w:r/>
+            <w:r>
+              <w:rPr>
+                <w:rFonts w:ascii="Calibri" w:hAnsi="Calibri" w:eastAsia="Calibri"/>
+                <w:b/>
+                <w:color w:val="1A1A1A"/>
+                <w:sz w:val="16"/>
+              </w:rPr>
+              <w:t>Yes — VPN / admin console</w:t>
             </w:r>
           </w:p>
         </w:tc>
@@ -4754,42 +4272,7 @@
               <w:bottom w:val="single" w:sz="4" w:space="0" w:color="8AA0B4"/>
               <w:right w:val="single" w:sz="4" w:space="0" w:color="8AA0B4"/>
             </w:tcBorders>
-            <w:shd w:fill="FFFFFF" w:val="clear"/>
-          </w:tcPr>
-          <w:p>
-            <w:pPr>
-              <w:spacing w:before="0" w:after="0" w:line="252" w:lineRule="auto"/>
-              <w:jc w:val="left"/>
-            </w:pPr>
-            <w:r/>
-            <w:r>
-              <w:rPr>
-                <w:rFonts w:ascii="Calibri" w:hAnsi="Calibri" w:eastAsia="Calibri"/>
-                <w:b w:val="0"/>
-                <w:color w:val="1A1A1A"/>
-                <w:sz w:val="16"/>
-              </w:rPr>
-              <w:t>Account register; joiner–mover–leaver records; privileged-account list; access-review logs</w:t>
-            </w:r>
-          </w:p>
-        </w:tc>
-        <w:tc>
-          <w:tcPr>
-            <w:tcW w:type="dxa" w:w="2381"/>
-            <w:vAlign w:val="center"/>
-            <w:tcMar>
-              <w:top w:w="40" w:type="dxa"/>
-              <w:left w:w="60" w:type="dxa"/>
-              <w:bottom w:w="40" w:type="dxa"/>
-              <w:right w:w="60" w:type="dxa"/>
-            </w:tcMar>
-            <w:tcBorders>
-              <w:top w:val="single" w:sz="4" w:space="0" w:color="8AA0B4"/>
-              <w:left w:val="single" w:sz="4" w:space="0" w:color="8AA0B4"/>
-              <w:bottom w:val="single" w:sz="4" w:space="0" w:color="8AA0B4"/>
-              <w:right w:val="single" w:sz="4" w:space="0" w:color="8AA0B4"/>
-            </w:tcBorders>
-            <w:shd w:fill="FFFFFF" w:val="clear"/>
+            <w:shd w:fill="F4D03F" w:val="clear"/>
           </w:tcPr>
           <w:p>
             <w:pPr>
@@ -4804,42 +4287,7 @@
                 <w:color w:val="1A1A1A"/>
                 <w:sz w:val="16"/>
               </w:rPr>
-              <w:t>Access Administrator (Primary) / HR/Admin Liaison (Backup)</w:t>
-            </w:r>
-          </w:p>
-        </w:tc>
-        <w:tc>
-          <w:tcPr>
-            <w:tcW w:type="dxa" w:w="2381"/>
-            <w:vAlign w:val="center"/>
-            <w:tcMar>
-              <w:top w:w="40" w:type="dxa"/>
-              <w:left w:w="60" w:type="dxa"/>
-              <w:bottom w:w="40" w:type="dxa"/>
-              <w:right w:w="60" w:type="dxa"/>
-            </w:tcMar>
-            <w:tcBorders>
-              <w:top w:val="single" w:sz="4" w:space="0" w:color="8AA0B4"/>
-              <w:left w:val="single" w:sz="4" w:space="0" w:color="8AA0B4"/>
-              <w:bottom w:val="single" w:sz="4" w:space="0" w:color="8AA0B4"/>
-              <w:right w:val="single" w:sz="4" w:space="0" w:color="8AA0B4"/>
-            </w:tcBorders>
-            <w:shd w:fill="FFFFFF" w:val="clear"/>
-          </w:tcPr>
-          <w:p>
-            <w:pPr>
-              <w:spacing w:before="0" w:after="0" w:line="252" w:lineRule="auto"/>
-              <w:jc w:val="left"/>
-            </w:pPr>
-            <w:r/>
-            <w:r>
-              <w:rPr>
-                <w:rFonts w:ascii="Calibri" w:hAnsi="Calibri" w:eastAsia="Calibri"/>
-                <w:b w:val="0"/>
-                <w:color w:val="1A1A1A"/>
-                <w:sz w:val="16"/>
-              </w:rPr>
-              <w:t>Identity/directory vendor</w:t>
+              <w:t>Partial — HR/Admin Liaison designated for leaver disable; confirm technical training</w:t>
             </w:r>
           </w:p>
         </w:tc>
@@ -4920,7 +4368,7 @@
         </w:tc>
         <w:tc>
           <w:tcPr>
-            <w:tcW w:type="dxa" w:w="2948"/>
+            <w:tcW w:type="dxa" w:w="3175"/>
             <w:vAlign w:val="center"/>
             <w:tcMar>
               <w:top w:w="40" w:type="dxa"/>
@@ -4949,13 +4397,13 @@
                 <w:color w:val="1A1A1A"/>
                 <w:sz w:val="16"/>
               </w:rPr>
-              <w:t>Test sign-off; client-agreed window; Business Development client communication; change calendar</w:t>
+              <w:t>Release Manager; release calendar held in one mailbox</w:t>
             </w:r>
           </w:p>
         </w:tc>
         <w:tc>
           <w:tcPr>
-            <w:tcW w:type="dxa" w:w="2835"/>
+            <w:tcW w:type="dxa" w:w="3175"/>
             <w:vAlign w:val="center"/>
             <w:tcMar>
               <w:top w:w="40" w:type="dxa"/>
@@ -4984,13 +4432,13 @@
                 <w:color w:val="1A1A1A"/>
                 <w:sz w:val="16"/>
               </w:rPr>
-              <w:t>Release Deployment; Business Development; client stakeholders</w:t>
+              <w:t>Ticketing portal; client communications; test sign-off before a date is committed</w:t>
             </w:r>
           </w:p>
         </w:tc>
         <w:tc>
           <w:tcPr>
-            <w:tcW w:type="dxa" w:w="2494"/>
+            <w:tcW w:type="dxa" w:w="3515"/>
             <w:vAlign w:val="center"/>
             <w:tcMar>
               <w:top w:w="40" w:type="dxa"/>
@@ -5019,7 +4467,42 @@
                 <w:color w:val="1A1A1A"/>
                 <w:sz w:val="16"/>
               </w:rPr>
-              <w:t>Ticketing portal; release/change calendar</w:t>
+              <w:t>Technical Lead holds the shared calendar; freeze releases if approvals cannot be evidenced</w:t>
+            </w:r>
+          </w:p>
+        </w:tc>
+        <w:tc>
+          <w:tcPr>
+            <w:tcW w:type="dxa" w:w="2268"/>
+            <w:vAlign w:val="center"/>
+            <w:tcMar>
+              <w:top w:w="40" w:type="dxa"/>
+              <w:left w:w="60" w:type="dxa"/>
+              <w:bottom w:w="40" w:type="dxa"/>
+              <w:right w:w="60" w:type="dxa"/>
+            </w:tcMar>
+            <w:tcBorders>
+              <w:top w:val="single" w:sz="4" w:space="0" w:color="8AA0B4"/>
+              <w:left w:val="single" w:sz="4" w:space="0" w:color="8AA0B4"/>
+              <w:bottom w:val="single" w:sz="4" w:space="0" w:color="8AA0B4"/>
+              <w:right w:val="single" w:sz="4" w:space="0" w:color="8AA0B4"/>
+            </w:tcBorders>
+            <w:shd w:fill="82C785" w:val="clear"/>
+          </w:tcPr>
+          <w:p>
+            <w:pPr>
+              <w:spacing w:before="0" w:after="0" w:line="252" w:lineRule="auto"/>
+              <w:jc w:val="center"/>
+            </w:pPr>
+            <w:r/>
+            <w:r>
+              <w:rPr>
+                <w:rFonts w:ascii="Calibri" w:hAnsi="Calibri" w:eastAsia="Calibri"/>
+                <w:b/>
+                <w:color w:val="1A1A1A"/>
+                <w:sz w:val="16"/>
+              </w:rPr>
+              <w:t>Yes — VPN / remote</w:t>
             </w:r>
           </w:p>
         </w:tc>
@@ -5039,42 +4522,7 @@
               <w:bottom w:val="single" w:sz="4" w:space="0" w:color="8AA0B4"/>
               <w:right w:val="single" w:sz="4" w:space="0" w:color="8AA0B4"/>
             </w:tcBorders>
-            <w:shd w:fill="F4F7FA" w:val="clear"/>
-          </w:tcPr>
-          <w:p>
-            <w:pPr>
-              <w:spacing w:before="0" w:after="0" w:line="252" w:lineRule="auto"/>
-              <w:jc w:val="left"/>
-            </w:pPr>
-            <w:r/>
-            <w:r>
-              <w:rPr>
-                <w:rFonts w:ascii="Calibri" w:hAnsi="Calibri" w:eastAsia="Calibri"/>
-                <w:b w:val="0"/>
-                <w:color w:val="1A1A1A"/>
-                <w:sz w:val="16"/>
-              </w:rPr>
-              <w:t>Release plans; client communications; approval records; go-live checklists</w:t>
-            </w:r>
-          </w:p>
-        </w:tc>
-        <w:tc>
-          <w:tcPr>
-            <w:tcW w:type="dxa" w:w="2381"/>
-            <w:vAlign w:val="center"/>
-            <w:tcMar>
-              <w:top w:w="40" w:type="dxa"/>
-              <w:left w:w="60" w:type="dxa"/>
-              <w:bottom w:w="40" w:type="dxa"/>
-              <w:right w:w="60" w:type="dxa"/>
-            </w:tcMar>
-            <w:tcBorders>
-              <w:top w:val="single" w:sz="4" w:space="0" w:color="8AA0B4"/>
-              <w:left w:val="single" w:sz="4" w:space="0" w:color="8AA0B4"/>
-              <w:bottom w:val="single" w:sz="4" w:space="0" w:color="8AA0B4"/>
-              <w:right w:val="single" w:sz="4" w:space="0" w:color="8AA0B4"/>
-            </w:tcBorders>
-            <w:shd w:fill="F4F7FA" w:val="clear"/>
+            <w:shd w:fill="F4D03F" w:val="clear"/>
           </w:tcPr>
           <w:p>
             <w:pPr>
@@ -5089,42 +4537,7 @@
                 <w:color w:val="1A1A1A"/>
                 <w:sz w:val="16"/>
               </w:rPr>
-              <w:t>Release Manager (Primary) / Technical Lead (Backup)</w:t>
-            </w:r>
-          </w:p>
-        </w:tc>
-        <w:tc>
-          <w:tcPr>
-            <w:tcW w:type="dxa" w:w="2381"/>
-            <w:vAlign w:val="center"/>
-            <w:tcMar>
-              <w:top w:w="40" w:type="dxa"/>
-              <w:left w:w="60" w:type="dxa"/>
-              <w:bottom w:w="40" w:type="dxa"/>
-              <w:right w:w="60" w:type="dxa"/>
-            </w:tcMar>
-            <w:tcBorders>
-              <w:top w:val="single" w:sz="4" w:space="0" w:color="8AA0B4"/>
-              <w:left w:val="single" w:sz="4" w:space="0" w:color="8AA0B4"/>
-              <w:bottom w:val="single" w:sz="4" w:space="0" w:color="8AA0B4"/>
-              <w:right w:val="single" w:sz="4" w:space="0" w:color="8AA0B4"/>
-            </w:tcBorders>
-            <w:shd w:fill="F4F7FA" w:val="clear"/>
-          </w:tcPr>
-          <w:p>
-            <w:pPr>
-              <w:spacing w:before="0" w:after="0" w:line="252" w:lineRule="auto"/>
-              <w:jc w:val="left"/>
-            </w:pPr>
-            <w:r/>
-            <w:r>
-              <w:rPr>
-                <w:rFonts w:ascii="Calibri" w:hAnsi="Calibri" w:eastAsia="Calibri"/>
-                <w:b w:val="0"/>
-                <w:color w:val="1A1A1A"/>
-                <w:sz w:val="16"/>
-              </w:rPr>
-              <w:t>Ticketing platform vendor</w:t>
+              <w:t>Partial — Technical Lead designated as backup</w:t>
             </w:r>
           </w:p>
         </w:tc>
@@ -5205,7 +4618,7 @@
         </w:tc>
         <w:tc>
           <w:tcPr>
-            <w:tcW w:type="dxa" w:w="2948"/>
+            <w:tcW w:type="dxa" w:w="3175"/>
             <w:vAlign w:val="center"/>
             <w:tcMar>
               <w:top w:w="40" w:type="dxa"/>
@@ -5234,13 +4647,13 @@
                 <w:color w:val="1A1A1A"/>
                 <w:sz w:val="16"/>
               </w:rPr>
-              <w:t>Cloud account and billing; network design; security baselines</w:t>
+              <w:t>Cloud Engineer; cloud provider outage; root/owner account</w:t>
             </w:r>
           </w:p>
         </w:tc>
         <w:tc>
           <w:tcPr>
-            <w:tcW w:type="dxa" w:w="2835"/>
+            <w:tcW w:type="dxa" w:w="3175"/>
             <w:vAlign w:val="center"/>
             <w:tcMar>
               <w:top w:w="40" w:type="dxa"/>
@@ -5269,13 +4682,13 @@
                 <w:color w:val="1A1A1A"/>
                 <w:sz w:val="16"/>
               </w:rPr>
-              <w:t>All environments; CI/CD targets; production availability; cost control</w:t>
+              <w:t>IAM / privilege maps; monitoring; infrastructure-as-code repository</w:t>
             </w:r>
           </w:p>
         </w:tc>
         <w:tc>
           <w:tcPr>
-            <w:tcW w:type="dxa" w:w="2494"/>
+            <w:tcW w:type="dxa" w:w="3515"/>
             <w:vAlign w:val="center"/>
             <w:tcMar>
               <w:top w:w="40" w:type="dxa"/>
@@ -5304,7 +4717,42 @@
                 <w:color w:val="1A1A1A"/>
                 <w:sz w:val="16"/>
               </w:rPr>
-              <w:t>Cloud management console; infrastructure-as-code repository; monitoring</w:t>
+              <w:t>DevOps Engineer rebuilds from infrastructure-as-code; provider support; documented break-glass account</w:t>
+            </w:r>
+          </w:p>
+        </w:tc>
+        <w:tc>
+          <w:tcPr>
+            <w:tcW w:type="dxa" w:w="2268"/>
+            <w:vAlign w:val="center"/>
+            <w:tcMar>
+              <w:top w:w="40" w:type="dxa"/>
+              <w:left w:w="60" w:type="dxa"/>
+              <w:bottom w:w="40" w:type="dxa"/>
+              <w:right w:w="60" w:type="dxa"/>
+            </w:tcMar>
+            <w:tcBorders>
+              <w:top w:val="single" w:sz="4" w:space="0" w:color="8AA0B4"/>
+              <w:left w:val="single" w:sz="4" w:space="0" w:color="8AA0B4"/>
+              <w:bottom w:val="single" w:sz="4" w:space="0" w:color="8AA0B4"/>
+              <w:right w:val="single" w:sz="4" w:space="0" w:color="8AA0B4"/>
+            </w:tcBorders>
+            <w:shd w:fill="82C785" w:val="clear"/>
+          </w:tcPr>
+          <w:p>
+            <w:pPr>
+              <w:spacing w:before="0" w:after="0" w:line="252" w:lineRule="auto"/>
+              <w:jc w:val="center"/>
+            </w:pPr>
+            <w:r/>
+            <w:r>
+              <w:rPr>
+                <w:rFonts w:ascii="Calibri" w:hAnsi="Calibri" w:eastAsia="Calibri"/>
+                <w:b/>
+                <w:color w:val="1A1A1A"/>
+                <w:sz w:val="16"/>
+              </w:rPr>
+              <w:t>Yes — cloud console from any location; provider region failover if contracted</w:t>
             </w:r>
           </w:p>
         </w:tc>
@@ -5324,42 +4772,7 @@
               <w:bottom w:val="single" w:sz="4" w:space="0" w:color="8AA0B4"/>
               <w:right w:val="single" w:sz="4" w:space="0" w:color="8AA0B4"/>
             </w:tcBorders>
-            <w:shd w:fill="FFFFFF" w:val="clear"/>
-          </w:tcPr>
-          <w:p>
-            <w:pPr>
-              <w:spacing w:before="0" w:after="0" w:line="252" w:lineRule="auto"/>
-              <w:jc w:val="left"/>
-            </w:pPr>
-            <w:r/>
-            <w:r>
-              <w:rPr>
-                <w:rFonts w:ascii="Calibri" w:hAnsi="Calibri" w:eastAsia="Calibri"/>
-                <w:b w:val="0"/>
-                <w:color w:val="1A1A1A"/>
-                <w:sz w:val="16"/>
-              </w:rPr>
-              <w:t>Infrastructure configuration; IAM/privilege maps; cost/usage data; security-group rules</w:t>
-            </w:r>
-          </w:p>
-        </w:tc>
-        <w:tc>
-          <w:tcPr>
-            <w:tcW w:type="dxa" w:w="2381"/>
-            <w:vAlign w:val="center"/>
-            <w:tcMar>
-              <w:top w:w="40" w:type="dxa"/>
-              <w:left w:w="60" w:type="dxa"/>
-              <w:bottom w:w="40" w:type="dxa"/>
-              <w:right w:w="60" w:type="dxa"/>
-            </w:tcMar>
-            <w:tcBorders>
-              <w:top w:val="single" w:sz="4" w:space="0" w:color="8AA0B4"/>
-              <w:left w:val="single" w:sz="4" w:space="0" w:color="8AA0B4"/>
-              <w:bottom w:val="single" w:sz="4" w:space="0" w:color="8AA0B4"/>
-              <w:right w:val="single" w:sz="4" w:space="0" w:color="8AA0B4"/>
-            </w:tcBorders>
-            <w:shd w:fill="FFFFFF" w:val="clear"/>
+            <w:shd w:fill="F4D03F" w:val="clear"/>
           </w:tcPr>
           <w:p>
             <w:pPr>
@@ -5374,42 +4787,7 @@
                 <w:color w:val="1A1A1A"/>
                 <w:sz w:val="16"/>
               </w:rPr>
-              <w:t>Cloud Engineer (Primary) / DevOps Engineer (Backup)</w:t>
-            </w:r>
-          </w:p>
-        </w:tc>
-        <w:tc>
-          <w:tcPr>
-            <w:tcW w:type="dxa" w:w="2381"/>
-            <w:vAlign w:val="center"/>
-            <w:tcMar>
-              <w:top w:w="40" w:type="dxa"/>
-              <w:left w:w="60" w:type="dxa"/>
-              <w:bottom w:w="40" w:type="dxa"/>
-              <w:right w:w="60" w:type="dxa"/>
-            </w:tcMar>
-            <w:tcBorders>
-              <w:top w:val="single" w:sz="4" w:space="0" w:color="8AA0B4"/>
-              <w:left w:val="single" w:sz="4" w:space="0" w:color="8AA0B4"/>
-              <w:bottom w:val="single" w:sz="4" w:space="0" w:color="8AA0B4"/>
-              <w:right w:val="single" w:sz="4" w:space="0" w:color="8AA0B4"/>
-            </w:tcBorders>
-            <w:shd w:fill="FFFFFF" w:val="clear"/>
-          </w:tcPr>
-          <w:p>
-            <w:pPr>
-              <w:spacing w:before="0" w:after="0" w:line="252" w:lineRule="auto"/>
-              <w:jc w:val="left"/>
-            </w:pPr>
-            <w:r/>
-            <w:r>
-              <w:rPr>
-                <w:rFonts w:ascii="Calibri" w:hAnsi="Calibri" w:eastAsia="Calibri"/>
-                <w:b w:val="0"/>
-                <w:color w:val="1A1A1A"/>
-                <w:sz w:val="16"/>
-              </w:rPr>
-              <w:t>Cloud provider</w:t>
+              <w:t>Partial — DevOps Engineer designated as backup</w:t>
             </w:r>
           </w:p>
         </w:tc>
@@ -5490,7 +4868,7 @@
         </w:tc>
         <w:tc>
           <w:tcPr>
-            <w:tcW w:type="dxa" w:w="2948"/>
+            <w:tcW w:type="dxa" w:w="3175"/>
             <w:vAlign w:val="center"/>
             <w:tcMar>
               <w:top w:w="40" w:type="dxa"/>
@@ -5519,13 +4897,13 @@
                 <w:color w:val="1A1A1A"/>
                 <w:sz w:val="16"/>
               </w:rPr>
-              <w:t>Application and infrastructure telemetry; log shipper; storage for logs</w:t>
+              <w:t>Monitoring platform; DevOps Engineer; log store</w:t>
             </w:r>
           </w:p>
         </w:tc>
         <w:tc>
           <w:tcPr>
-            <w:tcW w:type="dxa" w:w="2835"/>
+            <w:tcW w:type="dxa" w:w="3175"/>
             <w:vAlign w:val="center"/>
             <w:tcMar>
               <w:top w:w="40" w:type="dxa"/>
@@ -5554,13 +4932,13 @@
                 <w:color w:val="1A1A1A"/>
                 <w:sz w:val="16"/>
               </w:rPr>
-              <w:t>Incident Management; Production Support; audit and forensics</w:t>
+              <w:t>Alert-to-ticket in the ticketing portal; dashboards; log retention</w:t>
             </w:r>
           </w:p>
         </w:tc>
         <w:tc>
           <w:tcPr>
-            <w:tcW w:type="dxa" w:w="2494"/>
+            <w:tcW w:type="dxa" w:w="3515"/>
             <w:vAlign w:val="center"/>
             <w:tcMar>
               <w:top w:w="40" w:type="dxa"/>
@@ -5589,7 +4967,42 @@
                 <w:color w:val="1A1A1A"/>
                 <w:sz w:val="16"/>
               </w:rPr>
-              <w:t>Monitoring and alerting platform; log store; ticketing portal (alert to ticket)</w:t>
+              <w:t>Restore the platform from configuration backup; Support Lead uses client tickets as interim detection</w:t>
+            </w:r>
+          </w:p>
+        </w:tc>
+        <w:tc>
+          <w:tcPr>
+            <w:tcW w:type="dxa" w:w="2268"/>
+            <w:vAlign w:val="center"/>
+            <w:tcMar>
+              <w:top w:w="40" w:type="dxa"/>
+              <w:left w:w="60" w:type="dxa"/>
+              <w:bottom w:w="40" w:type="dxa"/>
+              <w:right w:w="60" w:type="dxa"/>
+            </w:tcMar>
+            <w:tcBorders>
+              <w:top w:val="single" w:sz="4" w:space="0" w:color="8AA0B4"/>
+              <w:left w:val="single" w:sz="4" w:space="0" w:color="8AA0B4"/>
+              <w:bottom w:val="single" w:sz="4" w:space="0" w:color="8AA0B4"/>
+              <w:right w:val="single" w:sz="4" w:space="0" w:color="8AA0B4"/>
+            </w:tcBorders>
+            <w:shd w:fill="82C785" w:val="clear"/>
+          </w:tcPr>
+          <w:p>
+            <w:pPr>
+              <w:spacing w:before="0" w:after="0" w:line="252" w:lineRule="auto"/>
+              <w:jc w:val="center"/>
+            </w:pPr>
+            <w:r/>
+            <w:r>
+              <w:rPr>
+                <w:rFonts w:ascii="Calibri" w:hAnsi="Calibri" w:eastAsia="Calibri"/>
+                <w:b/>
+                <w:color w:val="1A1A1A"/>
+                <w:sz w:val="16"/>
+              </w:rPr>
+              <w:t>Yes — VPN / remote to the monitoring console</w:t>
             </w:r>
           </w:p>
         </w:tc>
@@ -5609,42 +5022,7 @@
               <w:bottom w:val="single" w:sz="4" w:space="0" w:color="8AA0B4"/>
               <w:right w:val="single" w:sz="4" w:space="0" w:color="8AA0B4"/>
             </w:tcBorders>
-            <w:shd w:fill="F4F7FA" w:val="clear"/>
-          </w:tcPr>
-          <w:p>
-            <w:pPr>
-              <w:spacing w:before="0" w:after="0" w:line="252" w:lineRule="auto"/>
-              <w:jc w:val="left"/>
-            </w:pPr>
-            <w:r/>
-            <w:r>
-              <w:rPr>
-                <w:rFonts w:ascii="Calibri" w:hAnsi="Calibri" w:eastAsia="Calibri"/>
-                <w:b w:val="0"/>
-                <w:color w:val="1A1A1A"/>
-                <w:sz w:val="16"/>
-              </w:rPr>
-              <w:t>Logs; alert rules; dashboards; audit trails</w:t>
-            </w:r>
-          </w:p>
-        </w:tc>
-        <w:tc>
-          <w:tcPr>
-            <w:tcW w:type="dxa" w:w="2381"/>
-            <w:vAlign w:val="center"/>
-            <w:tcMar>
-              <w:top w:w="40" w:type="dxa"/>
-              <w:left w:w="60" w:type="dxa"/>
-              <w:bottom w:w="40" w:type="dxa"/>
-              <w:right w:w="60" w:type="dxa"/>
-            </w:tcMar>
-            <w:tcBorders>
-              <w:top w:val="single" w:sz="4" w:space="0" w:color="8AA0B4"/>
-              <w:left w:val="single" w:sz="4" w:space="0" w:color="8AA0B4"/>
-              <w:bottom w:val="single" w:sz="4" w:space="0" w:color="8AA0B4"/>
-              <w:right w:val="single" w:sz="4" w:space="0" w:color="8AA0B4"/>
-            </w:tcBorders>
-            <w:shd w:fill="F4F7FA" w:val="clear"/>
+            <w:shd w:fill="F4D03F" w:val="clear"/>
           </w:tcPr>
           <w:p>
             <w:pPr>
@@ -5659,42 +5037,7 @@
                 <w:color w:val="1A1A1A"/>
                 <w:sz w:val="16"/>
               </w:rPr>
-              <w:t>DevOps Engineer (Primary) / Support Lead (Backup)</w:t>
-            </w:r>
-          </w:p>
-        </w:tc>
-        <w:tc>
-          <w:tcPr>
-            <w:tcW w:type="dxa" w:w="2381"/>
-            <w:vAlign w:val="center"/>
-            <w:tcMar>
-              <w:top w:w="40" w:type="dxa"/>
-              <w:left w:w="60" w:type="dxa"/>
-              <w:bottom w:w="40" w:type="dxa"/>
-              <w:right w:w="60" w:type="dxa"/>
-            </w:tcMar>
-            <w:tcBorders>
-              <w:top w:val="single" w:sz="4" w:space="0" w:color="8AA0B4"/>
-              <w:left w:val="single" w:sz="4" w:space="0" w:color="8AA0B4"/>
-              <w:bottom w:val="single" w:sz="4" w:space="0" w:color="8AA0B4"/>
-              <w:right w:val="single" w:sz="4" w:space="0" w:color="8AA0B4"/>
-            </w:tcBorders>
-            <w:shd w:fill="F4F7FA" w:val="clear"/>
-          </w:tcPr>
-          <w:p>
-            <w:pPr>
-              <w:spacing w:before="0" w:after="0" w:line="252" w:lineRule="auto"/>
-              <w:jc w:val="left"/>
-            </w:pPr>
-            <w:r/>
-            <w:r>
-              <w:rPr>
-                <w:rFonts w:ascii="Calibri" w:hAnsi="Calibri" w:eastAsia="Calibri"/>
-                <w:b w:val="0"/>
-                <w:color w:val="1A1A1A"/>
-                <w:sz w:val="16"/>
-              </w:rPr>
-              <w:t>Monitoring/logging platform vendor</w:t>
+              <w:t>Partial — Support Lead designated for alert handling</w:t>
             </w:r>
           </w:p>
         </w:tc>
@@ -5775,7 +5118,7 @@
         </w:tc>
         <w:tc>
           <w:tcPr>
-            <w:tcW w:type="dxa" w:w="2948"/>
+            <w:tcW w:type="dxa" w:w="3175"/>
             <w:vAlign w:val="center"/>
             <w:tcMar>
               <w:top w:w="40" w:type="dxa"/>
@@ -5804,13 +5147,13 @@
                 <w:color w:val="1A1A1A"/>
                 <w:sz w:val="16"/>
               </w:rPr>
-              <w:t>Monitoring alerts; ticketing portal; on-call roster; VPN; logging; recent change records</w:t>
+              <w:t>Incident Manager; ticketing portal; a single on-call person</w:t>
             </w:r>
           </w:p>
         </w:tc>
         <w:tc>
           <w:tcPr>
-            <w:tcW w:type="dxa" w:w="2835"/>
+            <w:tcW w:type="dxa" w:w="3175"/>
             <w:vAlign w:val="center"/>
             <w:tcMar>
               <w:top w:w="40" w:type="dxa"/>
@@ -5839,13 +5182,13 @@
                 <w:color w:val="1A1A1A"/>
                 <w:sz w:val="16"/>
               </w:rPr>
-              <w:t>Business Development; client operations; live-service recovery</w:t>
+              <w:t>Escalation contacts; monitoring alerts; SLA clock; root-cause records</w:t>
             </w:r>
           </w:p>
         </w:tc>
         <w:tc>
           <w:tcPr>
-            <w:tcW w:type="dxa" w:w="2494"/>
+            <w:tcW w:type="dxa" w:w="3515"/>
             <w:vAlign w:val="center"/>
             <w:tcMar>
               <w:top w:w="40" w:type="dxa"/>
@@ -5874,7 +5217,42 @@
                 <w:color w:val="1A1A1A"/>
                 <w:sz w:val="16"/>
               </w:rPr>
-              <w:t>Ticketing portal; monitoring; VPN; production systems (Oracle ERP where applicable)</w:t>
+              <w:t>Support Lead runs the incident from the runbook; Business Development handles client communications; restore ticketing from the vendor</w:t>
+            </w:r>
+          </w:p>
+        </w:tc>
+        <w:tc>
+          <w:tcPr>
+            <w:tcW w:type="dxa" w:w="2268"/>
+            <w:vAlign w:val="center"/>
+            <w:tcMar>
+              <w:top w:w="40" w:type="dxa"/>
+              <w:left w:w="60" w:type="dxa"/>
+              <w:bottom w:w="40" w:type="dxa"/>
+              <w:right w:w="60" w:type="dxa"/>
+            </w:tcMar>
+            <w:tcBorders>
+              <w:top w:val="single" w:sz="4" w:space="0" w:color="8AA0B4"/>
+              <w:left w:val="single" w:sz="4" w:space="0" w:color="8AA0B4"/>
+              <w:bottom w:val="single" w:sz="4" w:space="0" w:color="8AA0B4"/>
+              <w:right w:val="single" w:sz="4" w:space="0" w:color="8AA0B4"/>
+            </w:tcBorders>
+            <w:shd w:fill="82C785" w:val="clear"/>
+          </w:tcPr>
+          <w:p>
+            <w:pPr>
+              <w:spacing w:before="0" w:after="0" w:line="252" w:lineRule="auto"/>
+              <w:jc w:val="center"/>
+            </w:pPr>
+            <w:r/>
+            <w:r>
+              <w:rPr>
+                <w:rFonts w:ascii="Calibri" w:hAnsi="Calibri" w:eastAsia="Calibri"/>
+                <w:b/>
+                <w:color w:val="1A1A1A"/>
+                <w:sz w:val="16"/>
+              </w:rPr>
+              <w:t>Yes — VPN / remote; the process does not need a second office</w:t>
             </w:r>
           </w:p>
         </w:tc>
@@ -5894,42 +5272,7 @@
               <w:bottom w:val="single" w:sz="4" w:space="0" w:color="8AA0B4"/>
               <w:right w:val="single" w:sz="4" w:space="0" w:color="8AA0B4"/>
             </w:tcBorders>
-            <w:shd w:fill="FFFFFF" w:val="clear"/>
-          </w:tcPr>
-          <w:p>
-            <w:pPr>
-              <w:spacing w:before="0" w:after="0" w:line="252" w:lineRule="auto"/>
-              <w:jc w:val="left"/>
-            </w:pPr>
-            <w:r/>
-            <w:r>
-              <w:rPr>
-                <w:rFonts w:ascii="Calibri" w:hAnsi="Calibri" w:eastAsia="Calibri"/>
-                <w:b w:val="0"/>
-                <w:color w:val="1A1A1A"/>
-                <w:sz w:val="16"/>
-              </w:rPr>
-              <w:t>Incident tickets; timeline; root-cause records; SLA clock; escalation contacts</w:t>
-            </w:r>
-          </w:p>
-        </w:tc>
-        <w:tc>
-          <w:tcPr>
-            <w:tcW w:type="dxa" w:w="2381"/>
-            <w:vAlign w:val="center"/>
-            <w:tcMar>
-              <w:top w:w="40" w:type="dxa"/>
-              <w:left w:w="60" w:type="dxa"/>
-              <w:bottom w:w="40" w:type="dxa"/>
-              <w:right w:w="60" w:type="dxa"/>
-            </w:tcMar>
-            <w:tcBorders>
-              <w:top w:val="single" w:sz="4" w:space="0" w:color="8AA0B4"/>
-              <w:left w:val="single" w:sz="4" w:space="0" w:color="8AA0B4"/>
-              <w:bottom w:val="single" w:sz="4" w:space="0" w:color="8AA0B4"/>
-              <w:right w:val="single" w:sz="4" w:space="0" w:color="8AA0B4"/>
-            </w:tcBorders>
-            <w:shd w:fill="FFFFFF" w:val="clear"/>
+            <w:shd w:fill="F4D03F" w:val="clear"/>
           </w:tcPr>
           <w:p>
             <w:pPr>
@@ -5944,42 +5287,7 @@
                 <w:color w:val="1A1A1A"/>
                 <w:sz w:val="16"/>
               </w:rPr>
-              <w:t>Incident Manager (Primary) / Support Lead (Backup)</w:t>
-            </w:r>
-          </w:p>
-        </w:tc>
-        <w:tc>
-          <w:tcPr>
-            <w:tcW w:type="dxa" w:w="2381"/>
-            <w:vAlign w:val="center"/>
-            <w:tcMar>
-              <w:top w:w="40" w:type="dxa"/>
-              <w:left w:w="60" w:type="dxa"/>
-              <w:bottom w:w="40" w:type="dxa"/>
-              <w:right w:w="60" w:type="dxa"/>
-            </w:tcMar>
-            <w:tcBorders>
-              <w:top w:val="single" w:sz="4" w:space="0" w:color="8AA0B4"/>
-              <w:left w:val="single" w:sz="4" w:space="0" w:color="8AA0B4"/>
-              <w:bottom w:val="single" w:sz="4" w:space="0" w:color="8AA0B4"/>
-              <w:right w:val="single" w:sz="4" w:space="0" w:color="8AA0B4"/>
-            </w:tcBorders>
-            <w:shd w:fill="FFFFFF" w:val="clear"/>
-          </w:tcPr>
-          <w:p>
-            <w:pPr>
-              <w:spacing w:before="0" w:after="0" w:line="252" w:lineRule="auto"/>
-              <w:jc w:val="left"/>
-            </w:pPr>
-            <w:r/>
-            <w:r>
-              <w:rPr>
-                <w:rFonts w:ascii="Calibri" w:hAnsi="Calibri" w:eastAsia="Calibri"/>
-                <w:b w:val="0"/>
-                <w:color w:val="1A1A1A"/>
-                <w:sz w:val="16"/>
-              </w:rPr>
-              <w:t>Oracle Corporation (if the incident is on Oracle ERP); cloud/hosting provider</w:t>
+              <w:t>Partial — Support Lead designated; confirm incident-command training</w:t>
             </w:r>
           </w:p>
         </w:tc>
@@ -6060,7 +5368,7 @@
         </w:tc>
         <w:tc>
           <w:tcPr>
-            <w:tcW w:type="dxa" w:w="2948"/>
+            <w:tcW w:type="dxa" w:w="3175"/>
             <w:vAlign w:val="center"/>
             <w:tcMar>
               <w:top w:w="40" w:type="dxa"/>
@@ -6089,13 +5397,13 @@
                 <w:color w:val="1A1A1A"/>
                 <w:sz w:val="16"/>
               </w:rPr>
-              <w:t>Approved retirement request; HR/Admin (access removal); backup/archive of required records</w:t>
+              <w:t>Technical Lead; checklist held in one share; residual access if the owner is absent</w:t>
             </w:r>
           </w:p>
         </w:tc>
         <w:tc>
           <w:tcPr>
-            <w:tcW w:type="dxa" w:w="2835"/>
+            <w:tcW w:type="dxa" w:w="3175"/>
             <w:vAlign w:val="center"/>
             <w:tcMar>
               <w:top w:w="40" w:type="dxa"/>
@@ -6124,13 +5432,13 @@
                 <w:color w:val="1A1A1A"/>
                 <w:sz w:val="16"/>
               </w:rPr>
-              <w:t>Finance (cost stop); Security (residual access); audit (record retention)</w:t>
+              <w:t>Decommission checklist; access-removal evidence; HR/Admin for account removal</w:t>
             </w:r>
           </w:p>
         </w:tc>
         <w:tc>
           <w:tcPr>
-            <w:tcW w:type="dxa" w:w="2494"/>
+            <w:tcW w:type="dxa" w:w="3515"/>
             <w:vAlign w:val="center"/>
             <w:tcMar>
               <w:top w:w="40" w:type="dxa"/>
@@ -6159,7 +5467,42 @@
                 <w:color w:val="1A1A1A"/>
                 <w:sz w:val="16"/>
               </w:rPr>
-              <w:t>Asset inventory; identity directory; backup/archive store; cloud console</w:t>
+              <w:t>Access Administrator completes access removal and archive; delay any non-urgent retirement</w:t>
+            </w:r>
+          </w:p>
+        </w:tc>
+        <w:tc>
+          <w:tcPr>
+            <w:tcW w:type="dxa" w:w="2268"/>
+            <w:vAlign w:val="center"/>
+            <w:tcMar>
+              <w:top w:w="40" w:type="dxa"/>
+              <w:left w:w="60" w:type="dxa"/>
+              <w:bottom w:w="40" w:type="dxa"/>
+              <w:right w:w="60" w:type="dxa"/>
+            </w:tcMar>
+            <w:tcBorders>
+              <w:top w:val="single" w:sz="4" w:space="0" w:color="8AA0B4"/>
+              <w:left w:val="single" w:sz="4" w:space="0" w:color="8AA0B4"/>
+              <w:bottom w:val="single" w:sz="4" w:space="0" w:color="8AA0B4"/>
+              <w:right w:val="single" w:sz="4" w:space="0" w:color="8AA0B4"/>
+            </w:tcBorders>
+            <w:shd w:fill="82C785" w:val="clear"/>
+          </w:tcPr>
+          <w:p>
+            <w:pPr>
+              <w:spacing w:before="0" w:after="0" w:line="252" w:lineRule="auto"/>
+              <w:jc w:val="center"/>
+            </w:pPr>
+            <w:r/>
+            <w:r>
+              <w:rPr>
+                <w:rFonts w:ascii="Calibri" w:hAnsi="Calibri" w:eastAsia="Calibri"/>
+                <w:b/>
+                <w:color w:val="1A1A1A"/>
+                <w:sz w:val="16"/>
+              </w:rPr>
+              <w:t>Yes — VPN / remote for access and cloud terminate; physical disposal may still need a site</w:t>
             </w:r>
           </w:p>
         </w:tc>
@@ -6179,42 +5522,7 @@
               <w:bottom w:val="single" w:sz="4" w:space="0" w:color="8AA0B4"/>
               <w:right w:val="single" w:sz="4" w:space="0" w:color="8AA0B4"/>
             </w:tcBorders>
-            <w:shd w:fill="F4F7FA" w:val="clear"/>
-          </w:tcPr>
-          <w:p>
-            <w:pPr>
-              <w:spacing w:before="0" w:after="0" w:line="252" w:lineRule="auto"/>
-              <w:jc w:val="left"/>
-            </w:pPr>
-            <w:r/>
-            <w:r>
-              <w:rPr>
-                <w:rFonts w:ascii="Calibri" w:hAnsi="Calibri" w:eastAsia="Calibri"/>
-                <w:b w:val="0"/>
-                <w:color w:val="1A1A1A"/>
-                <w:sz w:val="16"/>
-              </w:rPr>
-              <w:t>Decommission checklist; retained records; access-removal evidence; disposal certificates</w:t>
-            </w:r>
-          </w:p>
-        </w:tc>
-        <w:tc>
-          <w:tcPr>
-            <w:tcW w:type="dxa" w:w="2381"/>
-            <w:vAlign w:val="center"/>
-            <w:tcMar>
-              <w:top w:w="40" w:type="dxa"/>
-              <w:left w:w="60" w:type="dxa"/>
-              <w:bottom w:w="40" w:type="dxa"/>
-              <w:right w:w="60" w:type="dxa"/>
-            </w:tcMar>
-            <w:tcBorders>
-              <w:top w:val="single" w:sz="4" w:space="0" w:color="8AA0B4"/>
-              <w:left w:val="single" w:sz="4" w:space="0" w:color="8AA0B4"/>
-              <w:bottom w:val="single" w:sz="4" w:space="0" w:color="8AA0B4"/>
-              <w:right w:val="single" w:sz="4" w:space="0" w:color="8AA0B4"/>
-            </w:tcBorders>
-            <w:shd w:fill="F4F7FA" w:val="clear"/>
+            <w:shd w:fill="F4D03F" w:val="clear"/>
           </w:tcPr>
           <w:p>
             <w:pPr>
@@ -6229,42 +5537,7 @@
                 <w:color w:val="1A1A1A"/>
                 <w:sz w:val="16"/>
               </w:rPr>
-              <w:t>Technical Lead (Primary) / Access Administrator (Backup)</w:t>
-            </w:r>
-          </w:p>
-        </w:tc>
-        <w:tc>
-          <w:tcPr>
-            <w:tcW w:type="dxa" w:w="2381"/>
-            <w:vAlign w:val="center"/>
-            <w:tcMar>
-              <w:top w:w="40" w:type="dxa"/>
-              <w:left w:w="60" w:type="dxa"/>
-              <w:bottom w:w="40" w:type="dxa"/>
-              <w:right w:w="60" w:type="dxa"/>
-            </w:tcMar>
-            <w:tcBorders>
-              <w:top w:val="single" w:sz="4" w:space="0" w:color="8AA0B4"/>
-              <w:left w:val="single" w:sz="4" w:space="0" w:color="8AA0B4"/>
-              <w:bottom w:val="single" w:sz="4" w:space="0" w:color="8AA0B4"/>
-              <w:right w:val="single" w:sz="4" w:space="0" w:color="8AA0B4"/>
-            </w:tcBorders>
-            <w:shd w:fill="F4F7FA" w:val="clear"/>
-          </w:tcPr>
-          <w:p>
-            <w:pPr>
-              <w:spacing w:before="0" w:after="0" w:line="252" w:lineRule="auto"/>
-              <w:jc w:val="left"/>
-            </w:pPr>
-            <w:r/>
-            <w:r>
-              <w:rPr>
-                <w:rFonts w:ascii="Calibri" w:hAnsi="Calibri" w:eastAsia="Calibri"/>
-                <w:b w:val="0"/>
-                <w:color w:val="1A1A1A"/>
-                <w:sz w:val="16"/>
-              </w:rPr>
-              <w:t>Cloud/hosting provider (to terminate); records/archive or disposal vendor</w:t>
+              <w:t>Partial — Access Administrator designated as backup</w:t>
             </w:r>
           </w:p>
         </w:tc>
@@ -6281,7 +5554,7 @@
           <w:color w:val="5A6A7A"/>
           <w:sz w:val="18"/>
         </w:rPr>
-        <w:t>Draft for workshop. Replace role titles with named Primary / Backup staff, matching the format used in other departments (e.g. T. Alabi (Primary) / M. Yusuf (Backup)). Confirm product names for source control, CI/CD, cloud, database, and monitoring if they should appear as specific vendor platforms.</w:t>
+        <w:t>Draft for workshop. Alternate Site/Access Required? is Yes for VPN/remote Technical work unless a physical site is still needed. Cross-Trained Backup Staff Identified? is Partial until the team names a trained deputy. Confirm break-glass accounts, backup locations, and actual training in the meeting.</w:t>
       </w:r>
     </w:p>
     <w:sectPr>

</xml_diff>

<commit_message>
Set every Test Result Summary to Not yet tested with no date
Remove Q3/Q4 schedules so the column is not read as a prediction that the risk will occur. All 20 activities share the same value until a practice drill is run.

Co-authored-by: eyushans <eyushans@gmail.com>
</commit_message>
<xml_diff>
--- a/Technical_Department_BIA_Register.docx
+++ b/Technical_Department_BIA_Register.docx
@@ -27,7 +27,7 @@
           <w:color w:val="1A1A1A"/>
           <w:sz w:val="20"/>
         </w:rPr>
-        <w:t>This register maps each functional activity area performed by the Technical Department to its potential risk and to a Test Result Summary for BCP/DR exercises. Only Activity and Potential Risk are kept from the original register. No completed Technical Department restore/failover test log was provided, so these entries do not invent a pass. Rows are either not yet tested (with a schedule) or they note that remote/VPN work is already BAU while a formal test still has not been run. Replace with the real result after each exercise.</w:t>
+        <w:t>This register maps each functional activity area performed by the Technical Department to its potential risk and to a Test Result Summary. Only Activity and Potential Risk are kept from the original register. Test Result Summary records whether a practice drill has been run for recovering this activity (like a fire drill — not a prediction that the risk will happen). No drill has been run yet, so every row is “Not yet tested”.</w:t>
       </w:r>
     </w:p>
     <w:p>
@@ -50,7 +50,7 @@
           <w:color w:val="334155"/>
           <w:sz w:val="18"/>
         </w:rPr>
-        <w:t>Short note on the last BCP/DR exercise for this activity — a completed result with any finding, or “Not yet tested” plus a scheduled window. Same style as the organisation sample.</w:t>
+        <w:t>Whether a practice drill has been run for recovering this activity. Not a date the risk will occur. Currently “Not yet tested” for every row.</w:t>
       </w:r>
     </w:p>
     <w:tbl>
@@ -358,7 +358,7 @@
                 <w:color w:val="1A1A1A"/>
                 <w:sz w:val="18"/>
               </w:rPr>
-              <w:t>Remote-work via VPN is BAU; formal restore of the design repository not yet tested — scheduled for Q4 2026</w:t>
+              <w:t>Not yet tested</w:t>
             </w:r>
           </w:p>
         </w:tc>
@@ -468,7 +468,7 @@
                 <w:color w:val="1A1A1A"/>
                 <w:sz w:val="18"/>
               </w:rPr>
-              <w:t>Remote-work via VPN is BAU; workstation rebuild from last commit not yet tested — scheduled for Q4 2026</w:t>
+              <w:t>Not yet tested</w:t>
             </w:r>
           </w:p>
         </w:tc>
@@ -578,7 +578,7 @@
                 <w:color w:val="1A1A1A"/>
                 <w:sz w:val="18"/>
               </w:rPr>
-              <w:t>Not yet tested — repository restore/failover scheduled for Q3 2026</w:t>
+              <w:t>Not yet tested</w:t>
             </w:r>
           </w:p>
         </w:tc>
@@ -688,7 +688,7 @@
                 <w:color w:val="1A1A1A"/>
                 <w:sz w:val="18"/>
               </w:rPr>
-              <w:t>Not yet tested — backup-reviewer exercise scheduled for Q4 2026</w:t>
+              <w:t>Not yet tested</w:t>
             </w:r>
           </w:p>
         </w:tc>
@@ -798,7 +798,7 @@
                 <w:color w:val="1A1A1A"/>
                 <w:sz w:val="18"/>
               </w:rPr>
-              <w:t>Not yet tested — staging-environment rebuild scheduled for Q4 2026</w:t>
+              <w:t>Not yet tested</w:t>
             </w:r>
           </w:p>
         </w:tc>
@@ -908,7 +908,7 @@
                 <w:color w:val="1A1A1A"/>
                 <w:sz w:val="18"/>
               </w:rPr>
-              <w:t>Not yet tested — build-host rebuild from source-controlled definitions scheduled for Q4 2026</w:t>
+              <w:t>Not yet tested</w:t>
             </w:r>
           </w:p>
         </w:tc>
@@ -1018,7 +1018,7 @@
                 <w:color w:val="1A1A1A"/>
                 <w:sz w:val="18"/>
               </w:rPr>
-              <w:t>Not yet tested — pipeline restore and dual-control manual deploy scheduled for Q3 2026</w:t>
+              <w:t>Not yet tested</w:t>
             </w:r>
           </w:p>
         </w:tc>
@@ -1128,7 +1128,7 @@
                 <w:color w:val="1A1A1A"/>
                 <w:sz w:val="18"/>
               </w:rPr>
-              <w:t>Not yet tested — production rollback exercise scheduled for Q3 2026</w:t>
+              <w:t>Not yet tested</w:t>
             </w:r>
           </w:p>
         </w:tc>
@@ -1238,7 +1238,7 @@
                 <w:color w:val="1A1A1A"/>
                 <w:sz w:val="18"/>
               </w:rPr>
-              <w:t>Not yet tested — backup restore to an alternate host scheduled for Q3 2026</w:t>
+              <w:t>Not yet tested</w:t>
             </w:r>
           </w:p>
         </w:tc>
@@ -1348,7 +1348,7 @@
                 <w:color w:val="1A1A1A"/>
                 <w:sz w:val="18"/>
               </w:rPr>
-              <w:t>Not yet tested — emergency-patch exercise scheduled for Q4 2026</w:t>
+              <w:t>Not yet tested</w:t>
             </w:r>
           </w:p>
         </w:tc>
@@ -1458,7 +1458,7 @@
                 <w:color w:val="1A1A1A"/>
                 <w:sz w:val="18"/>
               </w:rPr>
-              <w:t>Not yet tested — break-glass admin and directory restore scheduled for Q3 2026</w:t>
+              <w:t>Not yet tested</w:t>
             </w:r>
           </w:p>
         </w:tc>
@@ -1568,7 +1568,7 @@
                 <w:color w:val="1A1A1A"/>
                 <w:sz w:val="18"/>
               </w:rPr>
-              <w:t>Not yet tested — environment rebuild from baseline scheduled for Q4 2026</w:t>
+              <w:t>Not yet tested</w:t>
             </w:r>
           </w:p>
         </w:tc>
@@ -1678,7 +1678,7 @@
                 <w:color w:val="1A1A1A"/>
                 <w:sz w:val="18"/>
               </w:rPr>
-              <w:t>Not yet tested — documented job rerun scheduled for Q3 2026, ahead of next close</w:t>
+              <w:t>Not yet tested</w:t>
             </w:r>
           </w:p>
         </w:tc>
@@ -1788,7 +1788,7 @@
                 <w:color w:val="1A1A1A"/>
                 <w:sz w:val="18"/>
               </w:rPr>
-              <w:t>Remote-work activation is BAU; ticketing/VPN failover not yet formally tested — scheduled for Q3 2026</w:t>
+              <w:t>Not yet tested</w:t>
             </w:r>
           </w:p>
         </w:tc>
@@ -1898,7 +1898,7 @@
                 <w:color w:val="1A1A1A"/>
                 <w:sz w:val="18"/>
               </w:rPr>
-              <w:t>Not yet tested — leaver-disable and directory restore scheduled for Q3 2026</w:t>
+              <w:t>Not yet tested</w:t>
             </w:r>
           </w:p>
         </w:tc>
@@ -2008,7 +2008,7 @@
                 <w:color w:val="1A1A1A"/>
                 <w:sz w:val="18"/>
               </w:rPr>
-              <w:t>Not yet tested — backup Release Manager exercise scheduled for Q4 2026</w:t>
+              <w:t>Not yet tested</w:t>
             </w:r>
           </w:p>
         </w:tc>
@@ -2118,7 +2118,7 @@
                 <w:color w:val="1A1A1A"/>
                 <w:sz w:val="18"/>
               </w:rPr>
-              <w:t>Not yet tested — infrastructure rebuild / provider failover scheduled for Q3 2026</w:t>
+              <w:t>Not yet tested</w:t>
             </w:r>
           </w:p>
         </w:tc>
@@ -2228,7 +2228,7 @@
                 <w:color w:val="1A1A1A"/>
                 <w:sz w:val="18"/>
               </w:rPr>
-              <w:t>Not yet tested — platform restore and alert-to-ticket failover scheduled for Q3 2026</w:t>
+              <w:t>Not yet tested</w:t>
             </w:r>
           </w:p>
         </w:tc>
@@ -2338,7 +2338,7 @@
                 <w:color w:val="1A1A1A"/>
                 <w:sz w:val="18"/>
               </w:rPr>
-              <w:t>Remote incident-command is BAU; full failover of ticketing/monitoring not yet tested — scheduled for Q3 2026</w:t>
+              <w:t>Not yet tested</w:t>
             </w:r>
           </w:p>
         </w:tc>
@@ -2448,7 +2448,7 @@
                 <w:color w:val="1A1A1A"/>
                 <w:sz w:val="18"/>
               </w:rPr>
-              <w:t>Not yet tested — scheduled for Q4 2026</w:t>
+              <w:t>Not yet tested</w:t>
             </w:r>
           </w:p>
         </w:tc>
@@ -2465,7 +2465,7 @@
           <w:color w:val="5A6A7A"/>
           <w:sz w:val="18"/>
         </w:rPr>
-        <w:t>Draft for workshop. These summaries are not a record of tests that have already been run. After each exercise, replace the row with the real result in the sample style (e.g. “Failover successful; manual logging step took longer than planned” or “Remote-work activation smooth; no issues identified”).</w:t>
+        <w:t>Every Test Result Summary is “Not yet tested” because no practice drill has been run yet. That is not a date and not a prediction that the risk will happen. After a drill, replace the cell with the real result (e.g. “Failover successful; manual logging step took longer than planned”).</w:t>
       </w:r>
     </w:p>
     <w:sectPr>

</xml_diff>